<commit_message>
May 1, 2026, 7:01 PM
</commit_message>
<xml_diff>
--- a/Resume/Resume-ATS.docx
+++ b/Resume/Resume-ATS.docx
@@ -1,19 +1,25 @@
 
 <file path=word/document.xml><?xml version="1.0" encoding="utf-8"?>
-<w:document xmlns:wpc="http://schemas.microsoft.com/office/word/2010/wordprocessingCanvas" xmlns:cx="http://schemas.microsoft.com/office/drawing/2014/chartex" xmlns:cx1="http://schemas.microsoft.com/office/drawing/2015/9/8/chartex" xmlns:cx2="http://schemas.microsoft.com/office/drawing/2015/10/21/chartex" xmlns:cx3="http://schemas.microsoft.com/office/drawing/2016/5/9/chartex" xmlns:cx4="http://schemas.microsoft.com/office/drawing/2016/5/10/chartex" xmlns:cx5="http://schemas.microsoft.com/office/drawing/2016/5/11/chartex" xmlns:cx6="http://schemas.microsoft.com/office/drawing/2016/5/12/chartex" xmlns:cx7="http://schemas.microsoft.com/office/drawing/2016/5/13/chartex" xmlns:cx8="http://schemas.microsoft.com/office/drawing/2016/5/14/chartex" xmlns:mc="http://schemas.openxmlformats.org/markup-compatibility/2006" xmlns:aink="http://schemas.microsoft.com/office/drawing/2016/ink" xmlns:am3d="http://schemas.microsoft.com/office/drawing/2017/model3d" xmlns:o="urn:schemas-microsoft-com:office:office" xmlns:oel="http://schemas.microsoft.com/office/2019/extlst" xmlns:r="http://schemas.openxmlformats.org/officeDocument/2006/relationships" xmlns:m="http://schemas.openxmlformats.org/officeDocument/2006/math" xmlns:v="urn:schemas-microsoft-com:vml" xmlns:wp14="http://schemas.microsoft.com/office/word/2010/wordprocessingDrawing" xmlns:wp="http://schemas.openxmlformats.org/drawingml/2006/wordprocessingDrawing" xmlns:w10="urn:schemas-microsoft-com:office:word" xmlns:w="http://schemas.openxmlformats.org/wordprocessingml/2006/main" xmlns:w14="http://schemas.microsoft.com/office/word/2010/wordml" xmlns:w15="http://schemas.microsoft.com/office/word/2012/wordml" xmlns:w16cex="http://schemas.microsoft.com/office/word/2018/wordml/cex" xmlns:w16cid="http://schemas.microsoft.com/office/word/2016/wordml/cid" xmlns:w16="http://schemas.microsoft.com/office/word/2018/wordml" xmlns:w16du="http://schemas.microsoft.com/office/word/2023/wordml/word16du" xmlns:w16sdtdh="http://schemas.microsoft.com/office/word/2020/wordml/sdtdatahash" xmlns:w16sdtfl="http://schemas.microsoft.com/office/word/2024/wordml/sdtformatlock" xmlns:w16se="http://schemas.microsoft.com/office/word/2015/wordml/symex" xmlns:wpg="http://schemas.microsoft.com/office/word/2010/wordprocessingGroup" xmlns:wpi="http://schemas.microsoft.com/office/word/2010/wordprocessingInk" xmlns:wne="http://schemas.microsoft.com/office/word/2006/wordml" xmlns:wps="http://schemas.microsoft.com/office/word/2010/wordprocessingShape" mc:Ignorable="w14 w15 w16se w16cid w16 w16cex w16sdtdh w16sdtfl w16du wp14">
+<w:document xmlns:wpc="http://schemas.microsoft.com/office/word/2010/wordprocessingCanvas" xmlns:cx="http://schemas.microsoft.com/office/drawing/2014/chartex" xmlns:cx1="http://schemas.microsoft.com/office/drawing/2015/9/8/chartex" xmlns:cx2="http://schemas.microsoft.com/office/drawing/2015/10/21/chartex" xmlns:cx3="http://schemas.microsoft.com/office/drawing/2016/5/9/chartex" xmlns:cx4="http://schemas.microsoft.com/office/drawing/2016/5/10/chartex" xmlns:cx5="http://schemas.microsoft.com/office/drawing/2016/5/11/chartex" xmlns:cx6="http://schemas.microsoft.com/office/drawing/2016/5/12/chartex" xmlns:cx7="http://schemas.microsoft.com/office/drawing/2016/5/13/chartex" xmlns:cx8="http://schemas.microsoft.com/office/drawing/2016/5/14/chartex" xmlns:mc="http://schemas.openxmlformats.org/markup-compatibility/2006" xmlns:aink="http://schemas.microsoft.com/office/drawing/2016/ink" xmlns:am3d="http://schemas.microsoft.com/office/drawing/2017/model3d" xmlns:o="urn:schemas-microsoft-com:office:office" xmlns:oel="http://schemas.microsoft.com/office/2019/extlst" xmlns:r="http://schemas.openxmlformats.org/officeDocument/2006/relationships" xmlns:m="http://schemas.openxmlformats.org/officeDocument/2006/math" xmlns:v="urn:schemas-microsoft-com:vml" xmlns:wp14="http://schemas.microsoft.com/office/word/2010/wordprocessingDrawing" xmlns:wp="http://schemas.openxmlformats.org/drawingml/2006/wordprocessingDrawing" xmlns:a="http://schemas.openxmlformats.org/drawingml/2006/main" xmlns:pic="http://schemas.openxmlformats.org/drawingml/2006/picture" xmlns:c="http://schemas.openxmlformats.org/drawingml/2006/chart" xmlns:dgm="http://schemas.openxmlformats.org/drawingml/2006/diagram" xmlns:lc="http://schemas.openxmlformats.org/drawingml/2006/lockedCanvas" xmlns:w10="urn:schemas-microsoft-com:office:word" xmlns:w="http://schemas.openxmlformats.org/wordprocessingml/2006/main" xmlns:w14="http://schemas.microsoft.com/office/word/2010/wordml" xmlns:w15="http://schemas.microsoft.com/office/word/2012/wordml" xmlns:w16cex="http://schemas.microsoft.com/office/word/2018/wordml/cex" xmlns:w16cid="http://schemas.microsoft.com/office/word/2016/wordml/cid" xmlns:w16="http://schemas.microsoft.com/office/word/2018/wordml" xmlns:w16du="http://schemas.microsoft.com/office/word/2023/wordml/word16du" xmlns:w16sdtdh="http://schemas.microsoft.com/office/word/2020/wordml/sdtdatahash" xmlns:w16sdtfl="http://schemas.microsoft.com/office/word/2024/wordml/sdtformatlock" xmlns:w16se="http://schemas.microsoft.com/office/word/2015/wordml/symex" xmlns:wpg="http://schemas.microsoft.com/office/word/2010/wordprocessingGroup" xmlns:wpi="http://schemas.microsoft.com/office/word/2010/wordprocessingInk" xmlns:wne="http://schemas.microsoft.com/office/word/2006/wordml" xmlns:wps="http://schemas.microsoft.com/office/word/2010/wordprocessingShape" mc:Ignorable="w14 w15 w16se w16cid w16 w16cex w16sdtdh w16sdtfl w16du wp14">
   <w:body>
     <w:tbl>
       <w:tblPr>
         <w:tblStyle w:val="TableGrid"/>
-        <w:tblpPr w:leftFromText="180" w:rightFromText="180" w:vertAnchor="page" w:horzAnchor="margin" w:tblpXSpec="center" w:tblpY="352"/>
+        <w:tblpPr w:leftFromText="180" w:rightFromText="180" w:tblpY="352" w:horzAnchor="margin" w:vertAnchor="page" w:tblpXSpec="center"/>
         <w:tblW w:w="11515" w:type="dxa"/>
         <w:tblBorders>
-          <w:top w:val="none" w:sz="0" w:space="0" w:color="auto"/>
-          <w:left w:val="none" w:sz="0" w:space="0" w:color="auto"/>
-          <w:bottom w:val="none" w:sz="0" w:space="0" w:color="auto"/>
-          <w:right w:val="none" w:sz="0" w:space="0" w:color="auto"/>
+          <w:top w:val="nil" w:color="auto" w:sz="0" w:space="0"/>
+          <w:left w:val="nil" w:color="auto" w:sz="0" w:space="0"/>
+          <w:bottom w:val="nil" w:color="auto" w:sz="0" w:space="0"/>
+          <w:right w:val="nil" w:color="auto" w:sz="0" w:space="0"/>
         </w:tblBorders>
-        <w:tblLook w:val="04A0" w:firstRow="1" w:lastRow="0" w:firstColumn="1" w:lastColumn="0" w:noHBand="0" w:noVBand="1"/>
+        <w:tblLook w:firstColumn="1" w:firstRow="1" w:lastColumn="0" w:lastRow="0" w:noHBand="0" w:noVBand="1" w:val="04A0"/>
+        <w:tblCellMar>
+          <w:top w:w="0" w:type="dxa"/>
+          <w:left w:w="108" w:type="dxa"/>
+          <w:bottom w:w="0" w:type="dxa"/>
+          <w:right w:w="108" w:type="dxa"/>
+        </w:tblCellMar>
       </w:tblPr>
       <w:tblGrid>
         <w:gridCol w:w="1530"/>
@@ -24,6 +30,7 @@
       </w:tblGrid>
       <w:tr>
         <w:trPr>
+          <w:hidden w:val="0"/>
           <w:trHeight w:val="720"/>
         </w:trPr>
         <w:tc>
@@ -47,7 +54,7 @@
             </w:pPr>
             <w:r>
               <w:rPr>
-                <w:rFonts w:ascii="Helvetica" w:hAnsi="Helvetica"/>
+                <w:rFonts w:ascii="Helvetica" w:hAnsi="Helvetica" w:eastAsia="Helvetica" w:cs="Helvetica"/>
                 <w:b/>
                 <w:bCs/>
                 <w:sz w:val="52"/>
@@ -60,6 +67,7 @@
       </w:tr>
       <w:tr>
         <w:trPr>
+          <w:hidden w:val="0"/>
           <w:trHeight w:val="251"/>
         </w:trPr>
         <w:tc>
@@ -80,7 +88,7 @@
             </w:pPr>
             <w:r>
               <w:rPr>
-                <w:rFonts w:ascii="Helvetica" w:hAnsi="Helvetica"/>
+                <w:rFonts w:ascii="Helvetica" w:hAnsi="Helvetica" w:eastAsia="Helvetica" w:cs="Helvetica"/>
                 <w:sz w:val="18"/>
                 <w:szCs w:val="18"/>
               </w:rPr>
@@ -104,13 +112,14 @@
                 <w:szCs w:val="18"/>
               </w:rPr>
             </w:pPr>
-            <w:hyperlink r:id="rId6" w:history="1">
+            <w:hyperlink w:history="1" r:id="rId6">
               <w:r>
                 <w:rPr>
                   <w:rStyle w:val="Hyperlink"/>
-                  <w:rFonts w:ascii="Helvetica" w:hAnsi="Helvetica"/>
+                  <w:rFonts w:ascii="Helvetica" w:hAnsi="Helvetica" w:eastAsia="Helvetica" w:cs="Helvetica"/>
                   <w:sz w:val="18"/>
                   <w:szCs w:val="18"/>
+                  <w:color w:val="467886"/>
                 </w:rPr>
                 <w:t>seminaia401@gmail.com</w:t>
               </w:r>
@@ -135,7 +144,7 @@
             </w:pPr>
             <w:r>
               <w:rPr>
-                <w:rFonts w:ascii="Helvetica" w:hAnsi="Helvetica"/>
+                <w:rFonts w:ascii="Helvetica" w:hAnsi="Helvetica" w:eastAsia="Helvetica" w:cs="Helvetica"/>
                 <w:b/>
                 <w:bCs/>
                 <w:sz w:val="18"/>
@@ -145,7 +154,7 @@
             </w:r>
             <w:r>
               <w:rPr>
-                <w:rFonts w:ascii="Helvetica" w:hAnsi="Helvetica"/>
+                <w:rFonts w:ascii="Helvetica" w:hAnsi="Helvetica" w:eastAsia="Helvetica" w:cs="Helvetica"/>
                 <w:sz w:val="18"/>
                 <w:szCs w:val="18"/>
               </w:rPr>
@@ -153,7 +162,7 @@
             </w:r>
             <w:r>
               <w:rPr>
-                <w:rFonts w:ascii="Helvetica" w:hAnsi="Helvetica"/>
+                <w:rFonts w:ascii="Helvetica" w:hAnsi="Helvetica" w:eastAsia="Helvetica" w:cs="Helvetica"/>
                 <w:sz w:val="18"/>
                 <w:szCs w:val="18"/>
               </w:rPr>
@@ -179,7 +188,7 @@
             </w:pPr>
             <w:r>
               <w:rPr>
-                <w:rFonts w:ascii="Helvetica" w:hAnsi="Helvetica"/>
+                <w:rFonts w:ascii="Helvetica" w:hAnsi="Helvetica" w:eastAsia="Helvetica" w:cs="Helvetica"/>
                 <w:b/>
                 <w:bCs/>
                 <w:sz w:val="18"/>
@@ -189,7 +198,7 @@
             </w:r>
             <w:r>
               <w:rPr>
-                <w:rFonts w:ascii="Helvetica" w:hAnsi="Helvetica"/>
+                <w:rFonts w:ascii="Helvetica" w:hAnsi="Helvetica" w:eastAsia="Helvetica" w:cs="Helvetica"/>
                 <w:sz w:val="18"/>
                 <w:szCs w:val="18"/>
               </w:rPr>
@@ -216,7 +225,7 @@
             </w:pPr>
             <w:r>
               <w:rPr>
-                <w:rFonts w:ascii="Helvetica" w:hAnsi="Helvetica"/>
+                <w:rFonts w:ascii="Helvetica" w:hAnsi="Helvetica" w:eastAsia="Helvetica" w:cs="Helvetica"/>
                 <w:sz w:val="18"/>
                 <w:szCs w:val="18"/>
               </w:rPr>
@@ -242,14 +251,20 @@
         <w:tblW w:w="10985" w:type="dxa"/>
         <w:tblInd w:w="-95" w:type="dxa"/>
         <w:tblBorders>
-          <w:top w:val="none" w:sz="0" w:space="0" w:color="auto"/>
-          <w:left w:val="none" w:sz="0" w:space="0" w:color="auto"/>
-          <w:bottom w:val="none" w:sz="0" w:space="0" w:color="auto"/>
-          <w:right w:val="none" w:sz="0" w:space="0" w:color="auto"/>
-          <w:insideH w:val="none" w:sz="0" w:space="0" w:color="auto"/>
-          <w:insideV w:val="none" w:sz="0" w:space="0" w:color="auto"/>
+          <w:top w:val="nil" w:color="auto" w:sz="0" w:space="0"/>
+          <w:left w:val="nil" w:color="auto" w:sz="0" w:space="0"/>
+          <w:bottom w:val="nil" w:color="auto" w:sz="0" w:space="0"/>
+          <w:right w:val="nil" w:color="auto" w:sz="0" w:space="0"/>
+          <w:insideH w:val="nil" w:color="auto" w:sz="0" w:space="0"/>
+          <w:insideV w:val="nil" w:color="auto" w:sz="0" w:space="0"/>
         </w:tblBorders>
-        <w:tblLook w:val="04A0" w:firstRow="1" w:lastRow="0" w:firstColumn="1" w:lastColumn="0" w:noHBand="0" w:noVBand="1"/>
+        <w:tblLook w:firstColumn="1" w:firstRow="1" w:lastColumn="0" w:lastRow="0" w:noHBand="0" w:noVBand="1" w:val="04A0"/>
+        <w:tblCellMar>
+          <w:top w:w="0" w:type="dxa"/>
+          <w:left w:w="108" w:type="dxa"/>
+          <w:bottom w:w="0" w:type="dxa"/>
+          <w:right w:w="108" w:type="dxa"/>
+        </w:tblCellMar>
       </w:tblPr>
       <w:tblGrid>
         <w:gridCol w:w="95"/>
@@ -259,6 +274,7 @@
       </w:tblGrid>
       <w:tr>
         <w:trPr>
+          <w:hidden w:val="0"/>
           <w:gridBefore w:val="1"/>
           <w:gridAfter w:val="1"/>
           <w:wBefore w:w="95" w:type="dxa"/>
@@ -269,7 +285,7 @@
             <w:tcW w:w="10790" w:type="dxa"/>
             <w:gridSpan w:val="2"/>
             <w:tcBorders>
-              <w:bottom w:val="single" w:sz="4" w:space="0" w:color="auto"/>
+              <w:bottom w:val="single" w:color="auto" w:sz="4" w:space="0"/>
             </w:tcBorders>
           </w:tcPr>
           <w:p>
@@ -282,7 +298,7 @@
             </w:pPr>
             <w:r>
               <w:rPr>
-                <w:rFonts w:ascii="Helvetica" w:hAnsi="Helvetica"/>
+                <w:rFonts w:ascii="Helvetica" w:hAnsi="Helvetica" w:eastAsia="Helvetica" w:cs="Helvetica"/>
                 <w:b/>
                 <w:bCs/>
               </w:rPr>
@@ -293,6 +309,7 @@
       </w:tr>
       <w:tr>
         <w:trPr>
+          <w:hidden w:val="0"/>
           <w:gridBefore w:val="1"/>
           <w:gridAfter w:val="1"/>
           <w:wBefore w:w="95" w:type="dxa"/>
@@ -303,7 +320,7 @@
             <w:tcW w:w="10790" w:type="dxa"/>
             <w:gridSpan w:val="2"/>
             <w:tcBorders>
-              <w:top w:val="single" w:sz="4" w:space="0" w:color="auto"/>
+              <w:top w:val="single" w:color="auto" w:sz="4" w:space="0"/>
             </w:tcBorders>
           </w:tcPr>
           <w:p>
@@ -316,7 +333,7 @@
             </w:pPr>
             <w:r>
               <w:rPr>
-                <w:rFonts w:ascii="Helvetica" w:hAnsi="Helvetica"/>
+                <w:rFonts w:ascii="Helvetica" w:hAnsi="Helvetica" w:eastAsia="Helvetica" w:cs="Helvetica"/>
                 <w:sz w:val="18"/>
                 <w:szCs w:val="18"/>
               </w:rPr>
@@ -327,6 +344,7 @@
       </w:tr>
       <w:tr>
         <w:trPr>
+          <w:hidden w:val="0"/>
           <w:gridBefore w:val="1"/>
           <w:gridAfter w:val="1"/>
           <w:wBefore w:w="95" w:type="dxa"/>
@@ -354,7 +372,7 @@
             <w:tcW w:w="10985" w:type="dxa"/>
             <w:gridSpan w:val="4"/>
             <w:tcBorders>
-              <w:bottom w:val="single" w:sz="4" w:space="0" w:color="auto"/>
+              <w:bottom w:val="single" w:color="auto" w:sz="4" w:space="0"/>
             </w:tcBorders>
           </w:tcPr>
           <w:p>
@@ -369,7 +387,7 @@
             </w:pPr>
             <w:r>
               <w:rPr>
-                <w:rFonts w:ascii="Helvetica" w:hAnsi="Helvetica"/>
+                <w:rFonts w:ascii="Helvetica" w:hAnsi="Helvetica" w:eastAsia="Helvetica" w:cs="Helvetica"/>
                 <w:b/>
                 <w:bCs/>
               </w:rPr>
@@ -384,7 +402,7 @@
             <w:tcW w:w="5130" w:type="dxa"/>
             <w:gridSpan w:val="2"/>
             <w:tcBorders>
-              <w:top w:val="single" w:sz="4" w:space="0" w:color="auto"/>
+              <w:top w:val="single" w:color="auto" w:sz="4" w:space="0"/>
             </w:tcBorders>
           </w:tcPr>
           <w:p>
@@ -399,7 +417,7 @@
             </w:pPr>
             <w:r>
               <w:rPr>
-                <w:rFonts w:ascii="Helvetica" w:hAnsi="Helvetica"/>
+                <w:rFonts w:ascii="Helvetica" w:hAnsi="Helvetica" w:eastAsia="Helvetica" w:cs="Helvetica"/>
                 <w:b/>
                 <w:bCs/>
                 <w:sz w:val="18"/>
@@ -414,7 +432,7 @@
             <w:tcW w:w="5855" w:type="dxa"/>
             <w:gridSpan w:val="2"/>
             <w:tcBorders>
-              <w:top w:val="single" w:sz="4" w:space="0" w:color="auto"/>
+              <w:top w:val="single" w:color="auto" w:sz="4" w:space="0"/>
             </w:tcBorders>
           </w:tcPr>
           <w:p>
@@ -430,7 +448,7 @@
             </w:pPr>
             <w:r>
               <w:rPr>
-                <w:rFonts w:ascii="Helvetica" w:hAnsi="Helvetica"/>
+                <w:rFonts w:ascii="Helvetica" w:hAnsi="Helvetica" w:eastAsia="Helvetica" w:cs="Helvetica"/>
                 <w:b/>
                 <w:bCs/>
                 <w:sz w:val="18"/>
@@ -461,7 +479,7 @@
             </w:pPr>
             <w:r>
               <w:rPr>
-                <w:rFonts w:ascii="Helvetica" w:hAnsi="Helvetica"/>
+                <w:rFonts w:ascii="Helvetica" w:hAnsi="Helvetica" w:eastAsia="Helvetica" w:cs="Helvetica"/>
                 <w:b/>
                 <w:bCs/>
                 <w:i/>
@@ -507,7 +525,7 @@
             </w:pPr>
             <w:r>
               <w:rPr>
-                <w:rFonts w:ascii="Helvetica" w:hAnsi="Helvetica"/>
+                <w:rFonts w:ascii="Helvetica" w:hAnsi="Helvetica" w:eastAsia="Helvetica" w:cs="Helvetica"/>
                 <w:b/>
                 <w:bCs/>
                 <w:sz w:val="18"/>
@@ -549,7 +567,7 @@
       </w:pPr>
       <w:r>
         <w:rPr>
-          <w:rFonts w:ascii="Helvetica" w:hAnsi="Helvetica"/>
+          <w:rFonts w:ascii="Helvetica" w:hAnsi="Helvetica" w:eastAsia="Helvetica" w:cs="Helvetica"/>
           <w:sz w:val="18"/>
           <w:szCs w:val="18"/>
         </w:rPr>
@@ -571,7 +589,7 @@
       </w:pPr>
       <w:r>
         <w:rPr>
-          <w:rFonts w:ascii="Helvetica" w:hAnsi="Helvetica"/>
+          <w:rFonts w:ascii="Helvetica" w:hAnsi="Helvetica" w:eastAsia="Helvetica" w:cs="Helvetica"/>
           <w:sz w:val="18"/>
           <w:szCs w:val="18"/>
         </w:rPr>
@@ -593,7 +611,7 @@
       </w:pPr>
       <w:r>
         <w:rPr>
-          <w:rFonts w:ascii="Helvetica" w:hAnsi="Helvetica"/>
+          <w:rFonts w:ascii="Helvetica" w:hAnsi="Helvetica" w:eastAsia="Helvetica" w:cs="Helvetica"/>
           <w:sz w:val="18"/>
           <w:szCs w:val="18"/>
         </w:rPr>
@@ -617,14 +635,20 @@
         <w:tblW w:w="10985" w:type="dxa"/>
         <w:tblInd w:w="-95" w:type="dxa"/>
         <w:tblBorders>
-          <w:top w:val="none" w:sz="0" w:space="0" w:color="auto"/>
-          <w:left w:val="none" w:sz="0" w:space="0" w:color="auto"/>
-          <w:bottom w:val="none" w:sz="0" w:space="0" w:color="auto"/>
-          <w:right w:val="none" w:sz="0" w:space="0" w:color="auto"/>
-          <w:insideH w:val="none" w:sz="0" w:space="0" w:color="auto"/>
-          <w:insideV w:val="none" w:sz="0" w:space="0" w:color="auto"/>
+          <w:top w:val="nil" w:color="auto" w:sz="0" w:space="0"/>
+          <w:left w:val="nil" w:color="auto" w:sz="0" w:space="0"/>
+          <w:bottom w:val="nil" w:color="auto" w:sz="0" w:space="0"/>
+          <w:right w:val="nil" w:color="auto" w:sz="0" w:space="0"/>
+          <w:insideH w:val="nil" w:color="auto" w:sz="0" w:space="0"/>
+          <w:insideV w:val="nil" w:color="auto" w:sz="0" w:space="0"/>
         </w:tblBorders>
-        <w:tblLook w:val="04A0" w:firstRow="1" w:lastRow="0" w:firstColumn="1" w:lastColumn="0" w:noHBand="0" w:noVBand="1"/>
+        <w:tblLook w:firstColumn="1" w:firstRow="1" w:lastColumn="0" w:lastRow="0" w:noHBand="0" w:noVBand="1" w:val="04A0"/>
+        <w:tblCellMar>
+          <w:top w:w="0" w:type="dxa"/>
+          <w:left w:w="108" w:type="dxa"/>
+          <w:bottom w:w="0" w:type="dxa"/>
+          <w:right w:w="108" w:type="dxa"/>
+        </w:tblCellMar>
       </w:tblPr>
       <w:tblGrid>
         <w:gridCol w:w="5130"/>
@@ -647,7 +671,7 @@
             </w:pPr>
             <w:r>
               <w:rPr>
-                <w:rFonts w:ascii="Helvetica" w:hAnsi="Helvetica"/>
+                <w:rFonts w:ascii="Helvetica" w:hAnsi="Helvetica" w:eastAsia="Helvetica" w:cs="Helvetica"/>
                 <w:b/>
                 <w:bCs/>
                 <w:sz w:val="18"/>
@@ -674,7 +698,7 @@
             </w:pPr>
             <w:r>
               <w:rPr>
-                <w:rFonts w:ascii="Helvetica" w:hAnsi="Helvetica"/>
+                <w:rFonts w:ascii="Helvetica" w:hAnsi="Helvetica" w:eastAsia="Helvetica" w:cs="Helvetica"/>
                 <w:b/>
                 <w:bCs/>
                 <w:sz w:val="18"/>
@@ -704,7 +728,7 @@
             </w:pPr>
             <w:r>
               <w:rPr>
-                <w:rFonts w:ascii="Helvetica" w:hAnsi="Helvetica"/>
+                <w:rFonts w:ascii="Helvetica" w:hAnsi="Helvetica" w:eastAsia="Helvetica" w:cs="Helvetica"/>
                 <w:b/>
                 <w:bCs/>
                 <w:i/>
@@ -748,7 +772,7 @@
             </w:pPr>
             <w:r>
               <w:rPr>
-                <w:rFonts w:ascii="Helvetica" w:hAnsi="Helvetica"/>
+                <w:rFonts w:ascii="Helvetica" w:hAnsi="Helvetica" w:eastAsia="Helvetica" w:cs="Helvetica"/>
                 <w:b/>
                 <w:bCs/>
                 <w:sz w:val="18"/>
@@ -789,7 +813,7 @@
       </w:pPr>
       <w:r>
         <w:rPr>
-          <w:rFonts w:ascii="Helvetica" w:hAnsi="Helvetica"/>
+          <w:rFonts w:ascii="Helvetica" w:hAnsi="Helvetica" w:eastAsia="Helvetica" w:cs="Helvetica"/>
           <w:sz w:val="18"/>
           <w:szCs w:val="18"/>
         </w:rPr>
@@ -811,7 +835,7 @@
       </w:pPr>
       <w:r>
         <w:rPr>
-          <w:rFonts w:ascii="Helvetica" w:hAnsi="Helvetica"/>
+          <w:rFonts w:ascii="Helvetica" w:hAnsi="Helvetica" w:eastAsia="Helvetica" w:cs="Helvetica"/>
           <w:sz w:val="18"/>
           <w:szCs w:val="18"/>
         </w:rPr>
@@ -833,7 +857,7 @@
       </w:pPr>
       <w:r>
         <w:rPr>
-          <w:rFonts w:ascii="Helvetica" w:hAnsi="Helvetica"/>
+          <w:rFonts w:ascii="Helvetica" w:hAnsi="Helvetica" w:eastAsia="Helvetica" w:cs="Helvetica"/>
           <w:sz w:val="18"/>
           <w:szCs w:val="18"/>
         </w:rPr>
@@ -855,7 +879,7 @@
       </w:pPr>
       <w:r>
         <w:rPr>
-          <w:rFonts w:ascii="Helvetica" w:hAnsi="Helvetica"/>
+          <w:rFonts w:ascii="Helvetica" w:hAnsi="Helvetica" w:eastAsia="Helvetica" w:cs="Helvetica"/>
           <w:sz w:val="18"/>
           <w:szCs w:val="18"/>
         </w:rPr>
@@ -879,14 +903,20 @@
         <w:tblW w:w="0" w:type="auto"/>
         <w:tblInd w:w="-95" w:type="dxa"/>
         <w:tblBorders>
-          <w:top w:val="none" w:sz="0" w:space="0" w:color="auto"/>
-          <w:left w:val="none" w:sz="0" w:space="0" w:color="auto"/>
-          <w:bottom w:val="none" w:sz="0" w:space="0" w:color="auto"/>
-          <w:right w:val="none" w:sz="0" w:space="0" w:color="auto"/>
-          <w:insideH w:val="none" w:sz="0" w:space="0" w:color="auto"/>
-          <w:insideV w:val="none" w:sz="0" w:space="0" w:color="auto"/>
+          <w:top w:val="nil" w:color="auto" w:sz="0" w:space="0"/>
+          <w:left w:val="nil" w:color="auto" w:sz="0" w:space="0"/>
+          <w:bottom w:val="nil" w:color="auto" w:sz="0" w:space="0"/>
+          <w:right w:val="nil" w:color="auto" w:sz="0" w:space="0"/>
+          <w:insideH w:val="nil" w:color="auto" w:sz="0" w:space="0"/>
+          <w:insideV w:val="nil" w:color="auto" w:sz="0" w:space="0"/>
         </w:tblBorders>
-        <w:tblLook w:val="04A0" w:firstRow="1" w:lastRow="0" w:firstColumn="1" w:lastColumn="0" w:noHBand="0" w:noVBand="1"/>
+        <w:tblLook w:firstColumn="1" w:firstRow="1" w:lastColumn="0" w:lastRow="0" w:noHBand="0" w:noVBand="1" w:val="04A0"/>
+        <w:tblCellMar>
+          <w:top w:w="0" w:type="dxa"/>
+          <w:left w:w="108" w:type="dxa"/>
+          <w:bottom w:w="0" w:type="dxa"/>
+          <w:right w:w="108" w:type="dxa"/>
+        </w:tblCellMar>
       </w:tblPr>
       <w:tblGrid>
         <w:gridCol w:w="5130"/>
@@ -909,7 +939,7 @@
             </w:pPr>
             <w:r>
               <w:rPr>
-                <w:rFonts w:ascii="Helvetica" w:hAnsi="Helvetica"/>
+                <w:rFonts w:ascii="Helvetica" w:hAnsi="Helvetica" w:eastAsia="Helvetica" w:cs="Helvetica"/>
                 <w:b/>
                 <w:bCs/>
                 <w:sz w:val="18"/>
@@ -936,7 +966,7 @@
             </w:pPr>
             <w:r>
               <w:rPr>
-                <w:rFonts w:ascii="Helvetica" w:hAnsi="Helvetica"/>
+                <w:rFonts w:ascii="Helvetica" w:hAnsi="Helvetica" w:eastAsia="Helvetica" w:cs="Helvetica"/>
                 <w:b/>
                 <w:bCs/>
                 <w:sz w:val="18"/>
@@ -966,7 +996,7 @@
             </w:pPr>
             <w:r>
               <w:rPr>
-                <w:rFonts w:ascii="Helvetica" w:hAnsi="Helvetica"/>
+                <w:rFonts w:ascii="Helvetica" w:hAnsi="Helvetica" w:eastAsia="Helvetica" w:cs="Helvetica"/>
                 <w:b/>
                 <w:bCs/>
                 <w:i/>
@@ -1010,7 +1040,7 @@
             </w:pPr>
             <w:r>
               <w:rPr>
-                <w:rFonts w:ascii="Helvetica" w:hAnsi="Helvetica"/>
+                <w:rFonts w:ascii="Helvetica" w:hAnsi="Helvetica" w:eastAsia="Helvetica" w:cs="Helvetica"/>
                 <w:b/>
                 <w:bCs/>
                 <w:sz w:val="18"/>
@@ -1051,7 +1081,7 @@
       </w:pPr>
       <w:r>
         <w:rPr>
-          <w:rFonts w:ascii="Helvetica" w:hAnsi="Helvetica"/>
+          <w:rFonts w:ascii="Helvetica" w:hAnsi="Helvetica" w:eastAsia="Helvetica" w:cs="Helvetica"/>
           <w:sz w:val="18"/>
           <w:szCs w:val="18"/>
         </w:rPr>
@@ -1073,7 +1103,7 @@
       </w:pPr>
       <w:r>
         <w:rPr>
-          <w:rFonts w:ascii="Helvetica" w:hAnsi="Helvetica"/>
+          <w:rFonts w:ascii="Helvetica" w:hAnsi="Helvetica" w:eastAsia="Helvetica" w:cs="Helvetica"/>
           <w:sz w:val="18"/>
           <w:szCs w:val="18"/>
         </w:rPr>
@@ -1096,14 +1126,20 @@
         <w:tblW w:w="0" w:type="auto"/>
         <w:tblInd w:w="-95" w:type="dxa"/>
         <w:tblBorders>
-          <w:top w:val="none" w:sz="0" w:space="0" w:color="auto"/>
-          <w:left w:val="none" w:sz="0" w:space="0" w:color="auto"/>
-          <w:bottom w:val="none" w:sz="0" w:space="0" w:color="auto"/>
-          <w:right w:val="none" w:sz="0" w:space="0" w:color="auto"/>
-          <w:insideH w:val="none" w:sz="0" w:space="0" w:color="auto"/>
-          <w:insideV w:val="none" w:sz="0" w:space="0" w:color="auto"/>
+          <w:top w:val="nil" w:color="auto" w:sz="0" w:space="0"/>
+          <w:left w:val="nil" w:color="auto" w:sz="0" w:space="0"/>
+          <w:bottom w:val="nil" w:color="auto" w:sz="0" w:space="0"/>
+          <w:right w:val="nil" w:color="auto" w:sz="0" w:space="0"/>
+          <w:insideH w:val="nil" w:color="auto" w:sz="0" w:space="0"/>
+          <w:insideV w:val="nil" w:color="auto" w:sz="0" w:space="0"/>
         </w:tblBorders>
-        <w:tblLook w:val="04A0" w:firstRow="1" w:lastRow="0" w:firstColumn="1" w:lastColumn="0" w:noHBand="0" w:noVBand="1"/>
+        <w:tblLook w:firstColumn="1" w:firstRow="1" w:lastColumn="0" w:lastRow="0" w:noHBand="0" w:noVBand="1" w:val="04A0"/>
+        <w:tblCellMar>
+          <w:top w:w="0" w:type="dxa"/>
+          <w:left w:w="108" w:type="dxa"/>
+          <w:bottom w:w="0" w:type="dxa"/>
+          <w:right w:w="108" w:type="dxa"/>
+        </w:tblCellMar>
       </w:tblPr>
       <w:tblGrid>
         <w:gridCol w:w="5130"/>
@@ -1126,7 +1162,7 @@
             </w:pPr>
             <w:r>
               <w:rPr>
-                <w:rFonts w:ascii="Helvetica" w:hAnsi="Helvetica"/>
+                <w:rFonts w:ascii="Helvetica" w:hAnsi="Helvetica" w:eastAsia="Helvetica" w:cs="Helvetica"/>
                 <w:b/>
                 <w:bCs/>
                 <w:sz w:val="18"/>
@@ -1153,7 +1189,7 @@
             </w:pPr>
             <w:r>
               <w:rPr>
-                <w:rFonts w:ascii="Helvetica" w:hAnsi="Helvetica"/>
+                <w:rFonts w:ascii="Helvetica" w:hAnsi="Helvetica" w:eastAsia="Helvetica" w:cs="Helvetica"/>
                 <w:b/>
                 <w:bCs/>
                 <w:sz w:val="18"/>
@@ -1183,7 +1219,7 @@
             </w:pPr>
             <w:r>
               <w:rPr>
-                <w:rFonts w:ascii="Helvetica" w:hAnsi="Helvetica"/>
+                <w:rFonts w:ascii="Helvetica" w:hAnsi="Helvetica" w:eastAsia="Helvetica" w:cs="Helvetica"/>
                 <w:b/>
                 <w:bCs/>
                 <w:i/>
@@ -1227,7 +1263,7 @@
             </w:pPr>
             <w:r>
               <w:rPr>
-                <w:rFonts w:ascii="Helvetica" w:hAnsi="Helvetica"/>
+                <w:rFonts w:ascii="Helvetica" w:hAnsi="Helvetica" w:eastAsia="Helvetica" w:cs="Helvetica"/>
                 <w:b/>
                 <w:bCs/>
                 <w:sz w:val="18"/>
@@ -1269,7 +1305,7 @@
       </w:pPr>
       <w:r>
         <w:rPr>
-          <w:rFonts w:ascii="Helvetica" w:hAnsi="Helvetica"/>
+          <w:rFonts w:ascii="Helvetica" w:hAnsi="Helvetica" w:eastAsia="Helvetica" w:cs="Helvetica"/>
           <w:sz w:val="18"/>
           <w:szCs w:val="18"/>
         </w:rPr>
@@ -1291,7 +1327,7 @@
       </w:pPr>
       <w:r>
         <w:rPr>
-          <w:rFonts w:ascii="Helvetica" w:hAnsi="Helvetica"/>
+          <w:rFonts w:ascii="Helvetica" w:hAnsi="Helvetica" w:eastAsia="Helvetica" w:cs="Helvetica"/>
           <w:sz w:val="18"/>
           <w:szCs w:val="18"/>
         </w:rPr>
@@ -1299,7 +1335,7 @@
       </w:r>
       <w:r>
         <w:rPr>
-          <w:rFonts w:ascii="Helvetica" w:hAnsi="Helvetica"/>
+          <w:rFonts w:ascii="Helvetica" w:hAnsi="Helvetica" w:eastAsia="Helvetica" w:cs="Helvetica"/>
           <w:sz w:val="18"/>
           <w:szCs w:val="18"/>
         </w:rPr>
@@ -1307,7 +1343,7 @@
       </w:r>
       <w:r>
         <w:rPr>
-          <w:rFonts w:ascii="Helvetica" w:hAnsi="Helvetica"/>
+          <w:rFonts w:ascii="Helvetica" w:hAnsi="Helvetica" w:eastAsia="Helvetica" w:cs="Helvetica"/>
           <w:sz w:val="18"/>
           <w:szCs w:val="18"/>
         </w:rPr>
@@ -1329,7 +1365,7 @@
       </w:pPr>
       <w:r>
         <w:rPr>
-          <w:rFonts w:ascii="Helvetica" w:hAnsi="Helvetica"/>
+          <w:rFonts w:ascii="Helvetica" w:hAnsi="Helvetica" w:eastAsia="Helvetica" w:cs="Helvetica"/>
           <w:sz w:val="18"/>
           <w:szCs w:val="18"/>
         </w:rPr>
@@ -1351,29 +1387,32 @@
       </w:pPr>
       <w:r>
         <w:rPr>
-          <w:rFonts w:ascii="Helvetica" w:hAnsi="Helvetica"/>
+          <w:rFonts w:ascii="Helvetica" w:hAnsi="Helvetica" w:eastAsia="Helvetica" w:cs="Helvetica"/>
           <w:sz w:val="18"/>
           <w:szCs w:val="18"/>
         </w:rPr>
         <w:t>Collected and interpreted analytical data using SDS-PAGE, HPLC/MS, GC/MS, and UV-Vis to confirm purity, identity, and process performance.</w:t>
       </w:r>
     </w:p>
-    <w:p>
-      <w:pPr>
-        <w:spacing w:after="0" w:line="240" w:lineRule="auto"/>
-        <w:ind w:left="720"/>
-        <w:rPr>
-          <w:rFonts w:ascii="Helvetica" w:hAnsi="Helvetica"/>
-          <w:sz w:val="18"/>
-          <w:szCs w:val="18"/>
-        </w:rPr>
-      </w:pPr>
-    </w:p>
     <w:tbl>
       <w:tblPr>
         <w:tblStyle w:val="TableGrid"/>
         <w:tblW w:w="10800" w:type="dxa"/>
-        <w:tblLook w:val="04A0" w:firstRow="1" w:lastRow="0" w:firstColumn="1" w:lastColumn="0" w:noHBand="0" w:noVBand="1"/>
+        <w:tblLook w:firstColumn="1" w:firstRow="1" w:lastColumn="0" w:lastRow="0" w:noHBand="0" w:noVBand="1" w:val="04A0"/>
+        <w:tblCellMar>
+          <w:top w:w="0" w:type="dxa"/>
+          <w:left w:w="108" w:type="dxa"/>
+          <w:bottom w:w="0" w:type="dxa"/>
+          <w:right w:w="108" w:type="dxa"/>
+        </w:tblCellMar>
+        <w:tblBorders>
+          <w:top w:val="nil" w:color="auto" w:sz="0" w:space="0"/>
+          <w:left w:val="nil" w:color="auto" w:sz="0" w:space="0"/>
+          <w:bottom w:val="nil" w:color="auto" w:sz="0" w:space="0"/>
+          <w:right w:val="nil" w:color="auto" w:sz="0" w:space="0"/>
+          <w:insideH w:val="nil" w:color="auto" w:sz="0" w:space="0"/>
+          <w:insideV w:val="nil" w:color="auto" w:sz="0" w:space="0"/>
+        </w:tblBorders>
       </w:tblPr>
       <w:tblGrid>
         <w:gridCol w:w="4675"/>
@@ -1382,13 +1421,13 @@
       <w:tr>
         <w:tc>
           <w:tcPr>
-            <w:tcW w:w="10790" w:type="dxa"/>
+            <w:tcW w:w="10800" w:type="dxa"/>
             <w:gridSpan w:val="2"/>
             <w:tcBorders>
-              <w:top w:val="nil"/>
-              <w:left w:val="nil"/>
-              <w:bottom w:val="single" w:sz="4" w:space="0" w:color="auto"/>
-              <w:right w:val="nil"/>
+              <w:top w:val="nil" w:color="auto" w:sz="0" w:space="0"/>
+              <w:bottom w:val="nil" w:color="auto" w:sz="0" w:space="0"/>
+              <w:left w:val="nil" w:color="auto" w:sz="0" w:space="0"/>
+              <w:right w:val="nil" w:color="auto" w:sz="0" w:space="0"/>
             </w:tcBorders>
           </w:tcPr>
           <w:p>
@@ -1401,9 +1440,34 @@
                 <w:szCs w:val="32"/>
               </w:rPr>
             </w:pPr>
-            <w:r>
-              <w:rPr>
-                <w:rFonts w:ascii="Helvetica" w:hAnsi="Helvetica"/>
+          </w:p>
+        </w:tc>
+      </w:tr>
+      <w:tr>
+        <w:tc>
+          <w:tcPr>
+            <w:tcW w:w="10800" w:type="dxa"/>
+            <w:gridSpan w:val="2"/>
+            <w:tcBorders>
+              <w:top w:val="nil" w:color="auto" w:sz="0" w:space="0"/>
+              <w:bottom w:val="nil" w:color="auto" w:sz="0" w:space="0"/>
+              <w:left w:val="nil" w:color="auto" w:sz="0" w:space="0"/>
+              <w:right w:val="nil" w:color="auto" w:sz="0" w:space="0"/>
+            </w:tcBorders>
+          </w:tcPr>
+          <w:p>
+            <w:pPr>
+              <w:rPr>
+                <w:rFonts w:ascii="Helvetica" w:hAnsi="Helvetica"/>
+                <w:b/>
+                <w:bCs/>
+                <w:sz w:val="28"/>
+                <w:szCs w:val="32"/>
+              </w:rPr>
+            </w:pPr>
+            <w:r>
+              <w:rPr>
+                <w:rFonts w:ascii="Helvetica" w:hAnsi="Helvetica" w:eastAsia="Helvetica" w:cs="Helvetica"/>
                 <w:b/>
                 <w:bCs/>
                 <w:sz w:val="28"/>
@@ -1417,19 +1481,22 @@
       <w:tr>
         <w:tblPrEx>
           <w:tblBorders>
-            <w:top w:val="none" w:sz="0" w:space="0" w:color="auto"/>
-            <w:left w:val="none" w:sz="0" w:space="0" w:color="auto"/>
-            <w:bottom w:val="none" w:sz="0" w:space="0" w:color="auto"/>
-            <w:right w:val="none" w:sz="0" w:space="0" w:color="auto"/>
-            <w:insideH w:val="none" w:sz="0" w:space="0" w:color="auto"/>
-            <w:insideV w:val="none" w:sz="0" w:space="0" w:color="auto"/>
+            <w:top w:val="nil" w:color="auto" w:sz="0" w:space="0"/>
+            <w:left w:val="nil" w:color="auto" w:sz="0" w:space="0"/>
+            <w:bottom w:val="nil" w:color="auto" w:sz="0" w:space="0"/>
+            <w:right w:val="nil" w:color="auto" w:sz="0" w:space="0"/>
+            <w:insideH w:val="nil" w:color="auto" w:sz="0" w:space="0"/>
+            <w:insideV w:val="nil" w:color="auto" w:sz="0" w:space="0"/>
           </w:tblBorders>
         </w:tblPrEx>
         <w:tc>
           <w:tcPr>
             <w:tcW w:w="4675" w:type="dxa"/>
             <w:tcBorders>
-              <w:top w:val="single" w:sz="4" w:space="0" w:color="auto"/>
+              <w:top w:val="nil" w:color="auto" w:sz="0" w:space="0"/>
+              <w:bottom w:val="nil" w:color="auto" w:sz="0" w:space="0"/>
+              <w:left w:val="nil" w:color="auto" w:sz="0" w:space="0"/>
+              <w:right w:val="nil" w:color="auto" w:sz="0" w:space="0"/>
             </w:tcBorders>
           </w:tcPr>
           <w:p>
@@ -1444,7 +1511,7 @@
             </w:pPr>
             <w:r>
               <w:rPr>
-                <w:rFonts w:ascii="Helvetica" w:hAnsi="Helvetica"/>
+                <w:rFonts w:ascii="Helvetica" w:hAnsi="Helvetica" w:eastAsia="Helvetica" w:cs="Helvetica"/>
                 <w:b/>
                 <w:bCs/>
                 <w:sz w:val="18"/>
@@ -1454,18 +1521,18 @@
             </w:r>
             <w:r>
               <w:rPr>
-                <w:rFonts w:ascii="Helvetica" w:hAnsi="Helvetica"/>
-                <w:b/>
-                <w:bCs/>
-                <w:sz w:val="18"/>
-                <w:szCs w:val="18"/>
-                <w:bdr w:val="single" w:sz="4" w:space="0" w:color="auto"/>
+                <w:rFonts w:ascii="Helvetica" w:hAnsi="Helvetica" w:eastAsia="Helvetica" w:cs="Helvetica"/>
+                <w:b/>
+                <w:bCs/>
+                <w:sz w:val="18"/>
+                <w:szCs w:val="18"/>
+                <w:bdr w:val="single" w:color="auto" w:sz="4" w:space="0"/>
               </w:rPr>
               <w:t>.</w:t>
             </w:r>
             <w:r>
               <w:rPr>
-                <w:rFonts w:ascii="Helvetica" w:hAnsi="Helvetica"/>
+                <w:rFonts w:ascii="Helvetica" w:hAnsi="Helvetica" w:eastAsia="Helvetica" w:cs="Helvetica"/>
                 <w:b/>
                 <w:bCs/>
                 <w:sz w:val="18"/>
@@ -1479,7 +1546,10 @@
           <w:tcPr>
             <w:tcW w:w="6125" w:type="dxa"/>
             <w:tcBorders>
-              <w:top w:val="single" w:sz="4" w:space="0" w:color="auto"/>
+              <w:top w:val="nil" w:color="auto" w:sz="0" w:space="0"/>
+              <w:bottom w:val="nil" w:color="auto" w:sz="0" w:space="0"/>
+              <w:left w:val="nil" w:color="auto" w:sz="0" w:space="0"/>
+              <w:right w:val="nil" w:color="auto" w:sz="0" w:space="0"/>
             </w:tcBorders>
           </w:tcPr>
           <w:p>
@@ -1495,7 +1565,7 @@
             </w:pPr>
             <w:r>
               <w:rPr>
-                <w:rFonts w:ascii="Helvetica" w:hAnsi="Helvetica"/>
+                <w:rFonts w:ascii="Helvetica" w:hAnsi="Helvetica" w:eastAsia="Helvetica" w:cs="Helvetica"/>
                 <w:b/>
                 <w:bCs/>
                 <w:sz w:val="18"/>
@@ -1505,7 +1575,7 @@
             </w:r>
             <w:r>
               <w:rPr>
-                <w:rFonts w:ascii="Helvetica" w:hAnsi="Helvetica"/>
+                <w:rFonts w:ascii="Helvetica" w:hAnsi="Helvetica" w:eastAsia="Helvetica" w:cs="Helvetica"/>
                 <w:b/>
                 <w:bCs/>
                 <w:sz w:val="18"/>
@@ -1515,7 +1585,7 @@
             </w:r>
             <w:r>
               <w:rPr>
-                <w:rFonts w:ascii="Helvetica" w:hAnsi="Helvetica"/>
+                <w:rFonts w:ascii="Helvetica" w:hAnsi="Helvetica" w:eastAsia="Helvetica" w:cs="Helvetica"/>
                 <w:b/>
                 <w:bCs/>
                 <w:sz w:val="18"/>
@@ -1525,7 +1595,7 @@
             </w:r>
             <w:r>
               <w:rPr>
-                <w:rFonts w:ascii="Helvetica" w:hAnsi="Helvetica"/>
+                <w:rFonts w:ascii="Helvetica" w:hAnsi="Helvetica" w:eastAsia="Helvetica" w:cs="Helvetica"/>
                 <w:b/>
                 <w:bCs/>
                 <w:sz w:val="18"/>
@@ -1539,17 +1609,23 @@
       <w:tr>
         <w:tblPrEx>
           <w:tblBorders>
-            <w:top w:val="none" w:sz="0" w:space="0" w:color="auto"/>
-            <w:left w:val="none" w:sz="0" w:space="0" w:color="auto"/>
-            <w:bottom w:val="none" w:sz="0" w:space="0" w:color="auto"/>
-            <w:right w:val="none" w:sz="0" w:space="0" w:color="auto"/>
-            <w:insideH w:val="none" w:sz="0" w:space="0" w:color="auto"/>
-            <w:insideV w:val="none" w:sz="0" w:space="0" w:color="auto"/>
+            <w:top w:val="nil" w:color="auto" w:sz="0" w:space="0"/>
+            <w:left w:val="nil" w:color="auto" w:sz="0" w:space="0"/>
+            <w:bottom w:val="nil" w:color="auto" w:sz="0" w:space="0"/>
+            <w:right w:val="nil" w:color="auto" w:sz="0" w:space="0"/>
+            <w:insideH w:val="nil" w:color="auto" w:sz="0" w:space="0"/>
+            <w:insideV w:val="nil" w:color="auto" w:sz="0" w:space="0"/>
           </w:tblBorders>
         </w:tblPrEx>
         <w:tc>
           <w:tcPr>
             <w:tcW w:w="4675" w:type="dxa"/>
+            <w:tcBorders>
+              <w:top w:val="nil" w:color="auto" w:sz="0" w:space="0"/>
+              <w:bottom w:val="nil" w:color="auto" w:sz="0" w:space="0"/>
+              <w:left w:val="nil" w:color="auto" w:sz="0" w:space="0"/>
+              <w:right w:val="nil" w:color="auto" w:sz="0" w:space="0"/>
+            </w:tcBorders>
           </w:tcPr>
           <w:p>
             <w:pPr>
@@ -1565,7 +1641,7 @@
             </w:pPr>
             <w:r>
               <w:rPr>
-                <w:rFonts w:ascii="Helvetica" w:hAnsi="Helvetica"/>
+                <w:rFonts w:ascii="Helvetica" w:hAnsi="Helvetica" w:eastAsia="Helvetica" w:cs="Helvetica"/>
                 <w:b/>
                 <w:bCs/>
                 <w:i/>
@@ -1580,6 +1656,12 @@
         <w:tc>
           <w:tcPr>
             <w:tcW w:w="6125" w:type="dxa"/>
+            <w:tcBorders>
+              <w:top w:val="nil" w:color="auto" w:sz="0" w:space="0"/>
+              <w:bottom w:val="nil" w:color="auto" w:sz="0" w:space="0"/>
+              <w:left w:val="nil" w:color="auto" w:sz="0" w:space="0"/>
+              <w:right w:val="nil" w:color="auto" w:sz="0" w:space="0"/>
+            </w:tcBorders>
           </w:tcPr>
           <w:p>
             <w:pPr>
@@ -1595,31 +1677,37 @@
       <w:tr>
         <w:tblPrEx>
           <w:tblBorders>
-            <w:top w:val="none" w:sz="0" w:space="0" w:color="auto"/>
-            <w:left w:val="none" w:sz="0" w:space="0" w:color="auto"/>
-            <w:bottom w:val="none" w:sz="0" w:space="0" w:color="auto"/>
-            <w:right w:val="none" w:sz="0" w:space="0" w:color="auto"/>
-            <w:insideH w:val="none" w:sz="0" w:space="0" w:color="auto"/>
-            <w:insideV w:val="none" w:sz="0" w:space="0" w:color="auto"/>
+            <w:top w:val="nil" w:color="auto" w:sz="0" w:space="0"/>
+            <w:left w:val="nil" w:color="auto" w:sz="0" w:space="0"/>
+            <w:bottom w:val="nil" w:color="auto" w:sz="0" w:space="0"/>
+            <w:right w:val="nil" w:color="auto" w:sz="0" w:space="0"/>
+            <w:insideH w:val="nil" w:color="auto" w:sz="0" w:space="0"/>
+            <w:insideV w:val="nil" w:color="auto" w:sz="0" w:space="0"/>
           </w:tblBorders>
         </w:tblPrEx>
         <w:tc>
           <w:tcPr>
             <w:tcW w:w="4675" w:type="dxa"/>
-          </w:tcPr>
-          <w:p>
-            <w:pPr>
-              <w:rPr>
-                <w:rFonts w:ascii="Helvetica" w:hAnsi="Helvetica"/>
-                <w:b/>
-                <w:bCs/>
-                <w:sz w:val="18"/>
-                <w:szCs w:val="18"/>
-              </w:rPr>
-            </w:pPr>
-            <w:r>
-              <w:rPr>
-                <w:rFonts w:ascii="Helvetica" w:hAnsi="Helvetica"/>
+            <w:tcBorders>
+              <w:top w:val="nil" w:color="auto" w:sz="0" w:space="0"/>
+              <w:bottom w:val="nil" w:color="auto" w:sz="0" w:space="0"/>
+              <w:left w:val="nil" w:color="auto" w:sz="0" w:space="0"/>
+              <w:right w:val="nil" w:color="auto" w:sz="0" w:space="0"/>
+            </w:tcBorders>
+          </w:tcPr>
+          <w:p>
+            <w:pPr>
+              <w:rPr>
+                <w:rFonts w:ascii="Helvetica" w:hAnsi="Helvetica"/>
+                <w:b/>
+                <w:bCs/>
+                <w:sz w:val="18"/>
+                <w:szCs w:val="18"/>
+              </w:rPr>
+            </w:pPr>
+            <w:r>
+              <w:rPr>
+                <w:rFonts w:ascii="Helvetica" w:hAnsi="Helvetica" w:eastAsia="Helvetica" w:cs="Helvetica"/>
                 <w:b/>
                 <w:bCs/>
                 <w:sz w:val="18"/>
@@ -1632,6 +1720,12 @@
         <w:tc>
           <w:tcPr>
             <w:tcW w:w="6125" w:type="dxa"/>
+            <w:tcBorders>
+              <w:top w:val="nil" w:color="auto" w:sz="0" w:space="0"/>
+              <w:bottom w:val="nil" w:color="auto" w:sz="0" w:space="0"/>
+              <w:left w:val="nil" w:color="auto" w:sz="0" w:space="0"/>
+              <w:right w:val="nil" w:color="auto" w:sz="0" w:space="0"/>
+            </w:tcBorders>
           </w:tcPr>
           <w:p>
             <w:pPr>
@@ -1646,7 +1740,7 @@
             </w:pPr>
             <w:r>
               <w:rPr>
-                <w:rFonts w:ascii="Helvetica" w:hAnsi="Helvetica"/>
+                <w:rFonts w:ascii="Helvetica" w:hAnsi="Helvetica" w:eastAsia="Helvetica" w:cs="Helvetica"/>
                 <w:b/>
                 <w:bCs/>
                 <w:sz w:val="18"/>
@@ -1656,7 +1750,7 @@
             </w:r>
             <w:r>
               <w:rPr>
-                <w:rFonts w:ascii="Helvetica" w:hAnsi="Helvetica"/>
+                <w:rFonts w:ascii="Helvetica" w:hAnsi="Helvetica" w:eastAsia="Helvetica" w:cs="Helvetica"/>
                 <w:b/>
                 <w:bCs/>
                 <w:sz w:val="18"/>
@@ -1666,7 +1760,7 @@
             </w:r>
             <w:r>
               <w:rPr>
-                <w:rFonts w:ascii="Helvetica" w:hAnsi="Helvetica"/>
+                <w:rFonts w:ascii="Helvetica" w:hAnsi="Helvetica" w:eastAsia="Helvetica" w:cs="Helvetica"/>
                 <w:b/>
                 <w:bCs/>
                 <w:sz w:val="18"/>
@@ -1676,7 +1770,7 @@
             </w:r>
             <w:r>
               <w:rPr>
-                <w:rFonts w:ascii="Helvetica" w:hAnsi="Helvetica"/>
+                <w:rFonts w:ascii="Helvetica" w:hAnsi="Helvetica" w:eastAsia="Helvetica" w:cs="Helvetica"/>
                 <w:b/>
                 <w:bCs/>
                 <w:sz w:val="18"/>
@@ -1690,31 +1784,37 @@
       <w:tr>
         <w:tblPrEx>
           <w:tblBorders>
-            <w:top w:val="none" w:sz="0" w:space="0" w:color="auto"/>
-            <w:left w:val="none" w:sz="0" w:space="0" w:color="auto"/>
-            <w:bottom w:val="none" w:sz="0" w:space="0" w:color="auto"/>
-            <w:right w:val="none" w:sz="0" w:space="0" w:color="auto"/>
-            <w:insideH w:val="none" w:sz="0" w:space="0" w:color="auto"/>
-            <w:insideV w:val="none" w:sz="0" w:space="0" w:color="auto"/>
+            <w:top w:val="nil" w:color="auto" w:sz="0" w:space="0"/>
+            <w:left w:val="nil" w:color="auto" w:sz="0" w:space="0"/>
+            <w:bottom w:val="nil" w:color="auto" w:sz="0" w:space="0"/>
+            <w:right w:val="nil" w:color="auto" w:sz="0" w:space="0"/>
+            <w:insideH w:val="nil" w:color="auto" w:sz="0" w:space="0"/>
+            <w:insideV w:val="nil" w:color="auto" w:sz="0" w:space="0"/>
           </w:tblBorders>
         </w:tblPrEx>
         <w:tc>
           <w:tcPr>
             <w:tcW w:w="4675" w:type="dxa"/>
-          </w:tcPr>
-          <w:p>
-            <w:pPr>
-              <w:rPr>
-                <w:rFonts w:ascii="Helvetica" w:hAnsi="Helvetica"/>
-                <w:b/>
-                <w:bCs/>
-                <w:sz w:val="18"/>
-                <w:szCs w:val="18"/>
-              </w:rPr>
-            </w:pPr>
-            <w:r>
-              <w:rPr>
-                <w:rFonts w:ascii="Helvetica" w:hAnsi="Helvetica"/>
+            <w:tcBorders>
+              <w:top w:val="nil" w:color="auto" w:sz="0" w:space="0"/>
+              <w:bottom w:val="nil" w:color="auto" w:sz="0" w:space="0"/>
+              <w:left w:val="nil" w:color="auto" w:sz="0" w:space="0"/>
+              <w:right w:val="nil" w:color="auto" w:sz="0" w:space="0"/>
+            </w:tcBorders>
+          </w:tcPr>
+          <w:p>
+            <w:pPr>
+              <w:rPr>
+                <w:rFonts w:ascii="Helvetica" w:hAnsi="Helvetica"/>
+                <w:b/>
+                <w:bCs/>
+                <w:sz w:val="18"/>
+                <w:szCs w:val="18"/>
+              </w:rPr>
+            </w:pPr>
+            <w:r>
+              <w:rPr>
+                <w:rFonts w:ascii="Helvetica" w:hAnsi="Helvetica" w:eastAsia="Helvetica" w:cs="Helvetica"/>
                 <w:b/>
                 <w:bCs/>
                 <w:sz w:val="18"/>
@@ -1727,6 +1827,12 @@
         <w:tc>
           <w:tcPr>
             <w:tcW w:w="6125" w:type="dxa"/>
+            <w:tcBorders>
+              <w:top w:val="nil" w:color="auto" w:sz="0" w:space="0"/>
+              <w:bottom w:val="nil" w:color="auto" w:sz="0" w:space="0"/>
+              <w:left w:val="nil" w:color="auto" w:sz="0" w:space="0"/>
+              <w:right w:val="nil" w:color="auto" w:sz="0" w:space="0"/>
+            </w:tcBorders>
           </w:tcPr>
           <w:p>
             <w:pPr>
@@ -1742,31 +1848,37 @@
       <w:tr>
         <w:tblPrEx>
           <w:tblBorders>
-            <w:top w:val="none" w:sz="0" w:space="0" w:color="auto"/>
-            <w:left w:val="none" w:sz="0" w:space="0" w:color="auto"/>
-            <w:bottom w:val="none" w:sz="0" w:space="0" w:color="auto"/>
-            <w:right w:val="none" w:sz="0" w:space="0" w:color="auto"/>
-            <w:insideH w:val="none" w:sz="0" w:space="0" w:color="auto"/>
-            <w:insideV w:val="none" w:sz="0" w:space="0" w:color="auto"/>
+            <w:top w:val="nil" w:color="auto" w:sz="0" w:space="0"/>
+            <w:left w:val="nil" w:color="auto" w:sz="0" w:space="0"/>
+            <w:bottom w:val="nil" w:color="auto" w:sz="0" w:space="0"/>
+            <w:right w:val="nil" w:color="auto" w:sz="0" w:space="0"/>
+            <w:insideH w:val="nil" w:color="auto" w:sz="0" w:space="0"/>
+            <w:insideV w:val="nil" w:color="auto" w:sz="0" w:space="0"/>
           </w:tblBorders>
         </w:tblPrEx>
         <w:tc>
           <w:tcPr>
             <w:tcW w:w="4675" w:type="dxa"/>
-          </w:tcPr>
-          <w:p>
-            <w:pPr>
-              <w:rPr>
-                <w:rFonts w:ascii="Helvetica" w:hAnsi="Helvetica"/>
-                <w:b/>
-                <w:bCs/>
-                <w:sz w:val="18"/>
-                <w:szCs w:val="18"/>
-              </w:rPr>
-            </w:pPr>
-            <w:r>
-              <w:rPr>
-                <w:rFonts w:ascii="Helvetica" w:hAnsi="Helvetica"/>
+            <w:tcBorders>
+              <w:top w:val="nil" w:color="auto" w:sz="0" w:space="0"/>
+              <w:bottom w:val="nil" w:color="auto" w:sz="0" w:space="0"/>
+              <w:left w:val="nil" w:color="auto" w:sz="0" w:space="0"/>
+              <w:right w:val="nil" w:color="auto" w:sz="0" w:space="0"/>
+            </w:tcBorders>
+          </w:tcPr>
+          <w:p>
+            <w:pPr>
+              <w:rPr>
+                <w:rFonts w:ascii="Helvetica" w:hAnsi="Helvetica"/>
+                <w:b/>
+                <w:bCs/>
+                <w:sz w:val="18"/>
+                <w:szCs w:val="18"/>
+              </w:rPr>
+            </w:pPr>
+            <w:r>
+              <w:rPr>
+                <w:rFonts w:ascii="Helvetica" w:hAnsi="Helvetica" w:eastAsia="Helvetica" w:cs="Helvetica"/>
                 <w:b/>
                 <w:bCs/>
                 <w:sz w:val="18"/>
@@ -1779,6 +1891,12 @@
         <w:tc>
           <w:tcPr>
             <w:tcW w:w="6125" w:type="dxa"/>
+            <w:tcBorders>
+              <w:top w:val="nil" w:color="auto" w:sz="0" w:space="0"/>
+              <w:bottom w:val="nil" w:color="auto" w:sz="0" w:space="0"/>
+              <w:left w:val="nil" w:color="auto" w:sz="0" w:space="0"/>
+              <w:right w:val="nil" w:color="auto" w:sz="0" w:space="0"/>
+            </w:tcBorders>
           </w:tcPr>
           <w:p>
             <w:pPr>
@@ -1793,7 +1911,7 @@
             </w:pPr>
             <w:r>
               <w:rPr>
-                <w:rFonts w:ascii="Helvetica" w:hAnsi="Helvetica"/>
+                <w:rFonts w:ascii="Helvetica" w:hAnsi="Helvetica" w:eastAsia="Helvetica" w:cs="Helvetica"/>
                 <w:b/>
                 <w:bCs/>
                 <w:sz w:val="18"/>
@@ -1803,7 +1921,7 @@
             </w:r>
             <w:r>
               <w:rPr>
-                <w:rFonts w:ascii="Helvetica" w:hAnsi="Helvetica"/>
+                <w:rFonts w:ascii="Helvetica" w:hAnsi="Helvetica" w:eastAsia="Helvetica" w:cs="Helvetica"/>
                 <w:b/>
                 <w:bCs/>
                 <w:sz w:val="18"/>
@@ -1813,7 +1931,7 @@
             </w:r>
             <w:r>
               <w:rPr>
-                <w:rFonts w:ascii="Helvetica" w:hAnsi="Helvetica"/>
+                <w:rFonts w:ascii="Helvetica" w:hAnsi="Helvetica" w:eastAsia="Helvetica" w:cs="Helvetica"/>
                 <w:b/>
                 <w:bCs/>
                 <w:sz w:val="18"/>
@@ -1823,7 +1941,7 @@
             </w:r>
             <w:r>
               <w:rPr>
-                <w:rFonts w:ascii="Helvetica" w:hAnsi="Helvetica"/>
+                <w:rFonts w:ascii="Helvetica" w:hAnsi="Helvetica" w:eastAsia="Helvetica" w:cs="Helvetica"/>
                 <w:b/>
                 <w:bCs/>
                 <w:sz w:val="18"/>
@@ -1837,17 +1955,23 @@
       <w:tr>
         <w:tblPrEx>
           <w:tblBorders>
-            <w:top w:val="none" w:sz="0" w:space="0" w:color="auto"/>
-            <w:left w:val="none" w:sz="0" w:space="0" w:color="auto"/>
-            <w:bottom w:val="none" w:sz="0" w:space="0" w:color="auto"/>
-            <w:right w:val="none" w:sz="0" w:space="0" w:color="auto"/>
-            <w:insideH w:val="none" w:sz="0" w:space="0" w:color="auto"/>
-            <w:insideV w:val="none" w:sz="0" w:space="0" w:color="auto"/>
+            <w:top w:val="nil" w:color="auto" w:sz="0" w:space="0"/>
+            <w:left w:val="nil" w:color="auto" w:sz="0" w:space="0"/>
+            <w:bottom w:val="nil" w:color="auto" w:sz="0" w:space="0"/>
+            <w:right w:val="nil" w:color="auto" w:sz="0" w:space="0"/>
+            <w:insideH w:val="nil" w:color="auto" w:sz="0" w:space="0"/>
+            <w:insideV w:val="nil" w:color="auto" w:sz="0" w:space="0"/>
           </w:tblBorders>
         </w:tblPrEx>
         <w:tc>
           <w:tcPr>
             <w:tcW w:w="4675" w:type="dxa"/>
+            <w:tcBorders>
+              <w:top w:val="nil" w:color="auto" w:sz="0" w:space="0"/>
+              <w:bottom w:val="nil" w:color="auto" w:sz="0" w:space="0"/>
+              <w:left w:val="nil" w:color="auto" w:sz="0" w:space="0"/>
+              <w:right w:val="nil" w:color="auto" w:sz="0" w:space="0"/>
+            </w:tcBorders>
           </w:tcPr>
           <w:p>
             <w:pPr>
@@ -1863,7 +1987,7 @@
             </w:pPr>
             <w:r>
               <w:rPr>
-                <w:rFonts w:ascii="Helvetica" w:hAnsi="Helvetica"/>
+                <w:rFonts w:ascii="Helvetica" w:hAnsi="Helvetica" w:eastAsia="Helvetica" w:cs="Helvetica"/>
                 <w:b/>
                 <w:bCs/>
                 <w:i/>
@@ -1878,15 +2002,460 @@
         <w:tc>
           <w:tcPr>
             <w:tcW w:w="6125" w:type="dxa"/>
-          </w:tcPr>
-          <w:p>
-            <w:pPr>
-              <w:rPr>
-                <w:rFonts w:ascii="Helvetica" w:hAnsi="Helvetica"/>
-                <w:sz w:val="18"/>
-                <w:szCs w:val="18"/>
-              </w:rPr>
-            </w:pPr>
+            <w:tcBorders>
+              <w:top w:val="nil" w:color="auto" w:sz="0" w:space="0"/>
+              <w:bottom w:val="nil" w:color="auto" w:sz="0" w:space="0"/>
+              <w:left w:val="nil" w:color="auto" w:sz="0" w:space="0"/>
+              <w:right w:val="nil" w:color="auto" w:sz="0" w:space="0"/>
+            </w:tcBorders>
+          </w:tcPr>
+          <w:p/>
+        </w:tc>
+      </w:tr>
+    </w:tbl>
+    <w:tbl>
+      <w:tblPr>
+        <w:tblStyle w:val="TableGrid"/>
+        <w:tblW w:w="0" w:type="auto"/>
+        <w:tblBorders>
+          <w:top w:val="nil" w:color="auto" w:sz="0" w:space="0"/>
+          <w:left w:val="nil" w:color="auto" w:sz="0" w:space="0"/>
+          <w:bottom w:val="nil" w:color="auto" w:sz="0" w:space="0"/>
+          <w:right w:val="nil" w:color="auto" w:sz="0" w:space="0"/>
+          <w:insideH w:val="nil" w:color="auto" w:sz="0" w:space="0"/>
+          <w:insideV w:val="nil" w:color="auto" w:sz="0" w:space="0"/>
+        </w:tblBorders>
+        <w:tblLook w:firstColumn="1" w:firstRow="1" w:lastColumn="0" w:lastRow="0" w:noHBand="0" w:noVBand="1" w:val="04A0"/>
+        <w:tblCellMar>
+          <w:top w:w="0" w:type="dxa"/>
+          <w:left w:w="108" w:type="dxa"/>
+          <w:bottom w:w="0" w:type="dxa"/>
+          <w:right w:w="108" w:type="dxa"/>
+        </w:tblCellMar>
+      </w:tblPr>
+      <w:tblGrid>
+        <w:gridCol w:w="1615"/>
+        <w:gridCol w:w="9175"/>
+      </w:tblGrid>
+      <w:tr>
+        <w:tc>
+          <w:tcPr>
+            <w:tcW w:w="10790" w:type="dxa"/>
+            <w:gridSpan w:val="2"/>
+            <w:tcBorders>
+              <w:bottom w:val="single" w:color="auto" w:sz="4" w:space="0"/>
+            </w:tcBorders>
+          </w:tcPr>
+          <w:p>
+            <w:pPr>
+              <w:rPr>
+                <w:rFonts w:ascii="Helvetica" w:hAnsi="Helvetica"/>
+                <w:b/>
+                <w:bCs/>
+              </w:rPr>
+            </w:pPr>
+            <w:r>
+              <w:rPr>
+                <w:rFonts w:ascii="Helvetica" w:hAnsi="Helvetica" w:eastAsia="Helvetica" w:cs="Helvetica"/>
+                <w:b/>
+                <w:bCs/>
+              </w:rPr>
+              <w:t xml:space="preserve">Technical </w:t>
+            </w:r>
+            <w:r>
+              <w:rPr>
+                <w:rFonts w:ascii="Helvetica" w:hAnsi="Helvetica" w:eastAsia="Helvetica" w:cs="Helvetica"/>
+                <w:b/>
+                <w:bCs/>
+              </w:rPr>
+              <w:t>Skills</w:t>
+            </w:r>
+            <w:r>
+              <w:rPr>
+                <w:rFonts w:ascii="Helvetica" w:hAnsi="Helvetica" w:eastAsia="Helvetica" w:cs="Helvetica"/>
+                <w:b/>
+                <w:bCs/>
+              </w:rPr>
+              <w:t>:</w:t>
+            </w:r>
+          </w:p>
+        </w:tc>
+      </w:tr>
+      <w:tr>
+        <w:tc>
+          <w:tcPr>
+            <w:tcW w:w="1615" w:type="dxa"/>
+            <w:tcBorders>
+              <w:top w:val="single" w:color="auto" w:sz="4" w:space="0"/>
+            </w:tcBorders>
+          </w:tcPr>
+          <w:p>
+            <w:r>
+              <w:rPr>
+                <w:rFonts w:ascii="Helvetica" w:hAnsi="Helvetica" w:eastAsia="Helvetica" w:cs="Helvetica"/>
+                <w:b/>
+                <w:bCs/>
+                <w:sz w:val="18"/>
+                <w:szCs w:val="18"/>
+              </w:rPr>
+              <w:t xml:space="preserve">Process: </w:t>
+            </w:r>
+          </w:p>
+        </w:tc>
+        <w:tc>
+          <w:tcPr>
+            <w:tcW w:w="9175" w:type="dxa"/>
+            <w:tcBorders>
+              <w:top w:val="single" w:color="auto" w:sz="4" w:space="0"/>
+            </w:tcBorders>
+          </w:tcPr>
+          <w:p>
+            <w:pPr>
+              <w:rPr>
+                <w:rFonts w:ascii="Helvetica" w:hAnsi="Helvetica"/>
+                <w:b/>
+                <w:bCs/>
+                <w:sz w:val="18"/>
+                <w:szCs w:val="18"/>
+              </w:rPr>
+            </w:pPr>
+            <w:r>
+              <w:rPr>
+                <w:rFonts w:ascii="Helvetica" w:hAnsi="Helvetica" w:eastAsia="Helvetica" w:cs="Helvetica"/>
+                <w:sz w:val="18"/>
+                <w:szCs w:val="18"/>
+              </w:rPr>
+              <w:t>Process Optimization</w:t>
+            </w:r>
+            <w:r>
+              <w:rPr>
+                <w:rFonts w:ascii="Helvetica" w:hAnsi="Helvetica" w:eastAsia="Helvetica" w:cs="Helvetica"/>
+                <w:sz w:val="18"/>
+                <w:szCs w:val="18"/>
+              </w:rPr>
+              <w:t>,</w:t>
+            </w:r>
+            <w:r>
+              <w:rPr>
+                <w:rFonts w:ascii="Helvetica" w:hAnsi="Helvetica" w:eastAsia="Helvetica" w:cs="Helvetica"/>
+                <w:sz w:val="18"/>
+                <w:szCs w:val="18"/>
+              </w:rPr>
+              <w:t xml:space="preserve"> Statistical Process Control (SPC)</w:t>
+            </w:r>
+            <w:r>
+              <w:rPr>
+                <w:rFonts w:ascii="Helvetica" w:hAnsi="Helvetica" w:eastAsia="Helvetica" w:cs="Helvetica"/>
+                <w:sz w:val="18"/>
+                <w:szCs w:val="18"/>
+              </w:rPr>
+              <w:t xml:space="preserve">, </w:t>
+            </w:r>
+            <w:r>
+              <w:rPr>
+                <w:rFonts w:ascii="Helvetica" w:hAnsi="Helvetica" w:eastAsia="Helvetica" w:cs="Helvetica"/>
+                <w:sz w:val="18"/>
+                <w:szCs w:val="18"/>
+              </w:rPr>
+              <w:t>Troubleshooting</w:t>
+            </w:r>
+            <w:r>
+              <w:rPr>
+                <w:rFonts w:ascii="Helvetica" w:hAnsi="Helvetica" w:eastAsia="Helvetica" w:cs="Helvetica"/>
+                <w:sz w:val="18"/>
+                <w:szCs w:val="18"/>
+              </w:rPr>
+              <w:t>,</w:t>
+            </w:r>
+            <w:r>
+              <w:rPr>
+                <w:rFonts w:ascii="Helvetica" w:hAnsi="Helvetica" w:eastAsia="Helvetica" w:cs="Helvetica"/>
+                <w:sz w:val="18"/>
+                <w:szCs w:val="18"/>
+              </w:rPr>
+              <w:t xml:space="preserve"> </w:t>
+            </w:r>
+            <w:r>
+              <w:rPr>
+                <w:rFonts w:ascii="Helvetica" w:hAnsi="Helvetica" w:eastAsia="Helvetica" w:cs="Helvetica"/>
+                <w:sz w:val="18"/>
+                <w:szCs w:val="18"/>
+              </w:rPr>
+              <w:t>Process Monitoring</w:t>
+            </w:r>
+          </w:p>
+        </w:tc>
+      </w:tr>
+      <w:tr>
+        <w:tc>
+          <w:tcPr>
+            <w:tcW w:w="1615" w:type="dxa"/>
+          </w:tcPr>
+          <w:p>
+            <w:r>
+              <w:rPr>
+                <w:rFonts w:ascii="Helvetica" w:hAnsi="Helvetica" w:eastAsia="Helvetica" w:cs="Helvetica"/>
+                <w:b/>
+                <w:bCs/>
+                <w:sz w:val="18"/>
+                <w:szCs w:val="18"/>
+              </w:rPr>
+              <w:t>Manufacturing:</w:t>
+            </w:r>
+            <w:r>
+              <w:rPr>
+                <w:rFonts w:ascii="Helvetica" w:hAnsi="Helvetica" w:eastAsia="Helvetica" w:cs="Helvetica"/>
+                <w:b/>
+                <w:bCs/>
+                <w:sz w:val="18"/>
+                <w:szCs w:val="18"/>
+              </w:rPr>
+              <w:t xml:space="preserve"> </w:t>
+            </w:r>
+          </w:p>
+        </w:tc>
+        <w:tc>
+          <w:tcPr>
+            <w:tcW w:w="9175" w:type="dxa"/>
+          </w:tcPr>
+          <w:p>
+            <w:pPr>
+              <w:rPr>
+                <w:rFonts w:ascii="Helvetica" w:hAnsi="Helvetica"/>
+                <w:b/>
+                <w:bCs/>
+                <w:sz w:val="18"/>
+                <w:szCs w:val="18"/>
+              </w:rPr>
+            </w:pPr>
+            <w:r>
+              <w:rPr>
+                <w:rFonts w:ascii="Helvetica" w:hAnsi="Helvetica" w:eastAsia="Helvetica" w:cs="Helvetica"/>
+                <w:sz w:val="18"/>
+                <w:szCs w:val="18"/>
+              </w:rPr>
+              <w:t>SOP Development</w:t>
+            </w:r>
+            <w:r>
+              <w:rPr>
+                <w:rFonts w:ascii="Helvetica" w:hAnsi="Helvetica" w:eastAsia="Helvetica" w:cs="Helvetica"/>
+                <w:sz w:val="18"/>
+                <w:szCs w:val="18"/>
+              </w:rPr>
+              <w:t>,</w:t>
+            </w:r>
+            <w:r>
+              <w:rPr>
+                <w:rFonts w:ascii="Helvetica" w:hAnsi="Helvetica" w:eastAsia="Helvetica" w:cs="Helvetica"/>
+                <w:sz w:val="18"/>
+                <w:szCs w:val="18"/>
+              </w:rPr>
+              <w:t xml:space="preserve"> Root Cause Analysis</w:t>
+            </w:r>
+            <w:r>
+              <w:rPr>
+                <w:rFonts w:ascii="Helvetica" w:hAnsi="Helvetica" w:eastAsia="Helvetica" w:cs="Helvetica"/>
+                <w:sz w:val="18"/>
+                <w:szCs w:val="18"/>
+              </w:rPr>
+              <w:t xml:space="preserve">, </w:t>
+            </w:r>
+            <w:r>
+              <w:rPr>
+                <w:rFonts w:ascii="Helvetica" w:hAnsi="Helvetica" w:eastAsia="Helvetica" w:cs="Helvetica"/>
+                <w:sz w:val="18"/>
+                <w:szCs w:val="18"/>
+              </w:rPr>
+              <w:t>Lean / Six Sigma</w:t>
+            </w:r>
+            <w:r>
+              <w:rPr>
+                <w:rFonts w:ascii="Helvetica" w:hAnsi="Helvetica" w:eastAsia="Helvetica" w:cs="Helvetica"/>
+                <w:sz w:val="18"/>
+                <w:szCs w:val="18"/>
+              </w:rPr>
+              <w:t>,</w:t>
+            </w:r>
+            <w:r>
+              <w:rPr>
+                <w:rFonts w:ascii="Helvetica" w:hAnsi="Helvetica" w:eastAsia="Helvetica" w:cs="Helvetica"/>
+                <w:sz w:val="18"/>
+                <w:szCs w:val="18"/>
+              </w:rPr>
+              <w:t xml:space="preserve"> Design of Experiments (DOE)</w:t>
+            </w:r>
+            <w:r>
+              <w:rPr>
+                <w:rFonts w:ascii="Helvetica" w:hAnsi="Helvetica" w:eastAsia="Helvetica" w:cs="Helvetica"/>
+                <w:sz w:val="18"/>
+                <w:szCs w:val="18"/>
+              </w:rPr>
+              <w:t>,</w:t>
+            </w:r>
+            <w:r>
+              <w:rPr>
+                <w:rFonts w:ascii="Helvetica" w:hAnsi="Helvetica" w:eastAsia="Helvetica" w:cs="Helvetica"/>
+                <w:sz w:val="18"/>
+                <w:szCs w:val="18"/>
+              </w:rPr>
+              <w:t xml:space="preserve"> Manufacturing Support</w:t>
+            </w:r>
+            <w:r>
+              <w:rPr>
+                <w:rFonts w:ascii="Helvetica" w:hAnsi="Helvetica" w:eastAsia="Helvetica" w:cs="Helvetica"/>
+                <w:sz w:val="18"/>
+                <w:szCs w:val="18"/>
+              </w:rPr>
+              <w:t>,</w:t>
+            </w:r>
+            <w:r>
+              <w:rPr>
+                <w:rFonts w:ascii="Helvetica" w:hAnsi="Helvetica" w:eastAsia="Helvetica" w:cs="Helvetica"/>
+                <w:sz w:val="18"/>
+                <w:szCs w:val="18"/>
+              </w:rPr>
+              <w:t xml:space="preserve"> Technology Transfer</w:t>
+            </w:r>
+            <w:r>
+              <w:rPr>
+                <w:rFonts w:ascii="Helvetica" w:hAnsi="Helvetica" w:eastAsia="Helvetica" w:cs="Helvetica"/>
+                <w:sz w:val="18"/>
+                <w:szCs w:val="18"/>
+              </w:rPr>
+              <w:t xml:space="preserve">, </w:t>
+            </w:r>
+            <w:r>
+              <w:rPr>
+                <w:rFonts w:ascii="Helvetica" w:hAnsi="Helvetica" w:eastAsia="Helvetica" w:cs="Helvetica"/>
+                <w:sz w:val="18"/>
+                <w:szCs w:val="18"/>
+              </w:rPr>
+              <w:t>Continuous Improvement</w:t>
+            </w:r>
+            <w:r>
+              <w:rPr>
+                <w:rFonts w:ascii="Helvetica" w:hAnsi="Helvetica" w:eastAsia="Helvetica" w:cs="Helvetica"/>
+                <w:sz w:val="18"/>
+                <w:szCs w:val="18"/>
+              </w:rPr>
+              <w:t xml:space="preserve">, </w:t>
+            </w:r>
+            <w:r>
+              <w:rPr>
+                <w:rFonts w:ascii="Helvetica" w:hAnsi="Helvetica" w:eastAsia="Helvetica" w:cs="Helvetica"/>
+                <w:sz w:val="18"/>
+                <w:szCs w:val="18"/>
+              </w:rPr>
+              <w:t>cGMP</w:t>
+            </w:r>
+          </w:p>
+        </w:tc>
+      </w:tr>
+      <w:tr>
+        <w:tc>
+          <w:tcPr>
+            <w:tcW w:w="1615" w:type="dxa"/>
+          </w:tcPr>
+          <w:p>
+            <w:pPr>
+              <w:rPr>
+                <w:rFonts w:ascii="Helvetica" w:hAnsi="Helvetica"/>
+                <w:b/>
+                <w:bCs/>
+                <w:sz w:val="18"/>
+                <w:szCs w:val="18"/>
+              </w:rPr>
+            </w:pPr>
+            <w:r>
+              <w:rPr>
+                <w:rFonts w:ascii="Helvetica" w:hAnsi="Helvetica" w:eastAsia="Helvetica" w:cs="Helvetica"/>
+                <w:b/>
+                <w:bCs/>
+                <w:sz w:val="18"/>
+                <w:szCs w:val="18"/>
+              </w:rPr>
+              <w:t>Computational:</w:t>
+            </w:r>
+          </w:p>
+        </w:tc>
+        <w:tc>
+          <w:tcPr>
+            <w:tcW w:w="9175" w:type="dxa"/>
+          </w:tcPr>
+          <w:p>
+            <w:pPr>
+              <w:rPr>
+                <w:rFonts w:ascii="Helvetica" w:hAnsi="Helvetica"/>
+                <w:b/>
+                <w:bCs/>
+                <w:sz w:val="18"/>
+                <w:szCs w:val="18"/>
+              </w:rPr>
+            </w:pPr>
+            <w:r>
+              <w:rPr>
+                <w:rFonts w:ascii="Helvetica" w:hAnsi="Helvetica" w:eastAsia="Helvetica" w:cs="Helvetica"/>
+                <w:sz w:val="18"/>
+                <w:szCs w:val="18"/>
+              </w:rPr>
+              <w:t>MATLAB</w:t>
+            </w:r>
+            <w:r>
+              <w:rPr>
+                <w:rFonts w:ascii="Helvetica" w:hAnsi="Helvetica" w:eastAsia="Helvetica" w:cs="Helvetica"/>
+                <w:sz w:val="18"/>
+                <w:szCs w:val="18"/>
+              </w:rPr>
+              <w:t xml:space="preserve">, Simulink, </w:t>
+            </w:r>
+            <w:r>
+              <w:rPr>
+                <w:rFonts w:ascii="Helvetica" w:hAnsi="Helvetica" w:eastAsia="Helvetica" w:cs="Helvetica"/>
+                <w:sz w:val="18"/>
+                <w:szCs w:val="18"/>
+              </w:rPr>
+              <w:t>Python</w:t>
+            </w:r>
+            <w:r>
+              <w:rPr>
+                <w:rFonts w:ascii="Helvetica" w:hAnsi="Helvetica" w:eastAsia="Helvetica" w:cs="Helvetica"/>
+                <w:sz w:val="18"/>
+                <w:szCs w:val="18"/>
+              </w:rPr>
+              <w:t xml:space="preserve">, </w:t>
+            </w:r>
+            <w:r>
+              <w:rPr>
+                <w:rFonts w:ascii="Helvetica" w:hAnsi="Helvetica" w:eastAsia="Helvetica" w:cs="Helvetica"/>
+                <w:sz w:val="18"/>
+                <w:szCs w:val="18"/>
+              </w:rPr>
+              <w:t>ASPEN Plus Dynamics</w:t>
+            </w:r>
+            <w:r>
+              <w:rPr>
+                <w:rFonts w:ascii="Helvetica" w:hAnsi="Helvetica" w:eastAsia="Helvetica" w:cs="Helvetica"/>
+                <w:sz w:val="18"/>
+                <w:szCs w:val="18"/>
+              </w:rPr>
+              <w:t xml:space="preserve">, </w:t>
+            </w:r>
+            <w:r>
+              <w:rPr>
+                <w:rFonts w:ascii="Helvetica" w:hAnsi="Helvetica" w:eastAsia="Helvetica" w:cs="Helvetica"/>
+                <w:sz w:val="18"/>
+                <w:szCs w:val="18"/>
+              </w:rPr>
+              <w:t>Linux</w:t>
+            </w:r>
+            <w:r>
+              <w:rPr>
+                <w:rFonts w:ascii="Helvetica" w:hAnsi="Helvetica" w:eastAsia="Helvetica" w:cs="Helvetica"/>
+                <w:sz w:val="18"/>
+                <w:szCs w:val="18"/>
+              </w:rPr>
+              <w:t>, DFT (VASP &amp; GPAW), MD (LAMMPS)</w:t>
+            </w:r>
           </w:p>
         </w:tc>
       </w:tr>
@@ -1900,463 +2469,7 @@
           <w:szCs w:val="18"/>
         </w:rPr>
       </w:pPr>
-    </w:p>
-    <w:tbl>
-      <w:tblPr>
-        <w:tblStyle w:val="TableGrid"/>
-        <w:tblW w:w="0" w:type="auto"/>
-        <w:tblBorders>
-          <w:top w:val="none" w:sz="0" w:space="0" w:color="auto"/>
-          <w:left w:val="none" w:sz="0" w:space="0" w:color="auto"/>
-          <w:bottom w:val="none" w:sz="0" w:space="0" w:color="auto"/>
-          <w:right w:val="none" w:sz="0" w:space="0" w:color="auto"/>
-          <w:insideH w:val="none" w:sz="0" w:space="0" w:color="auto"/>
-          <w:insideV w:val="none" w:sz="0" w:space="0" w:color="auto"/>
-        </w:tblBorders>
-        <w:tblLook w:val="04A0" w:firstRow="1" w:lastRow="0" w:firstColumn="1" w:lastColumn="0" w:noHBand="0" w:noVBand="1"/>
-      </w:tblPr>
-      <w:tblGrid>
-        <w:gridCol w:w="1615"/>
-        <w:gridCol w:w="9175"/>
-      </w:tblGrid>
-      <w:tr>
-        <w:tc>
-          <w:tcPr>
-            <w:tcW w:w="10790" w:type="dxa"/>
-            <w:gridSpan w:val="2"/>
-            <w:tcBorders>
-              <w:bottom w:val="single" w:sz="4" w:space="0" w:color="auto"/>
-            </w:tcBorders>
-          </w:tcPr>
-          <w:p>
-            <w:pPr>
-              <w:rPr>
-                <w:rFonts w:ascii="Helvetica" w:hAnsi="Helvetica"/>
-                <w:b/>
-                <w:bCs/>
-              </w:rPr>
-            </w:pPr>
-            <w:r>
-              <w:rPr>
-                <w:rFonts w:ascii="Helvetica" w:hAnsi="Helvetica"/>
-                <w:b/>
-                <w:bCs/>
-              </w:rPr>
-              <w:t xml:space="preserve">Technical </w:t>
-            </w:r>
-            <w:r>
-              <w:rPr>
-                <w:rFonts w:ascii="Helvetica" w:hAnsi="Helvetica"/>
-                <w:b/>
-                <w:bCs/>
-              </w:rPr>
-              <w:t>Skills</w:t>
-            </w:r>
-            <w:r>
-              <w:rPr>
-                <w:rFonts w:ascii="Helvetica" w:hAnsi="Helvetica"/>
-                <w:b/>
-                <w:bCs/>
-              </w:rPr>
-              <w:t>:</w:t>
-            </w:r>
-          </w:p>
-        </w:tc>
-      </w:tr>
-      <w:tr>
-        <w:tc>
-          <w:tcPr>
-            <w:tcW w:w="1615" w:type="dxa"/>
-            <w:tcBorders>
-              <w:top w:val="single" w:sz="4" w:space="0" w:color="auto"/>
-            </w:tcBorders>
-          </w:tcPr>
-          <w:p>
-            <w:r>
-              <w:rPr>
-                <w:rFonts w:ascii="Helvetica" w:hAnsi="Helvetica"/>
-                <w:b/>
-                <w:bCs/>
-                <w:sz w:val="18"/>
-                <w:szCs w:val="18"/>
-              </w:rPr>
-              <w:t xml:space="preserve">Process: </w:t>
-            </w:r>
-          </w:p>
-        </w:tc>
-        <w:tc>
-          <w:tcPr>
-            <w:tcW w:w="9175" w:type="dxa"/>
-            <w:tcBorders>
-              <w:top w:val="single" w:sz="4" w:space="0" w:color="auto"/>
-            </w:tcBorders>
-          </w:tcPr>
-          <w:p>
-            <w:pPr>
-              <w:rPr>
-                <w:rFonts w:ascii="Helvetica" w:hAnsi="Helvetica"/>
-                <w:b/>
-                <w:bCs/>
-                <w:sz w:val="18"/>
-                <w:szCs w:val="18"/>
-              </w:rPr>
-            </w:pPr>
-            <w:r>
-              <w:rPr>
-                <w:rFonts w:ascii="Helvetica" w:hAnsi="Helvetica"/>
-                <w:sz w:val="18"/>
-                <w:szCs w:val="18"/>
-              </w:rPr>
-              <w:t>Process Optimization</w:t>
-            </w:r>
-            <w:r>
-              <w:rPr>
-                <w:rFonts w:ascii="Helvetica" w:hAnsi="Helvetica"/>
-                <w:sz w:val="18"/>
-                <w:szCs w:val="18"/>
-              </w:rPr>
-              <w:t>,</w:t>
-            </w:r>
-            <w:r>
-              <w:rPr>
-                <w:rFonts w:ascii="Helvetica" w:hAnsi="Helvetica"/>
-                <w:sz w:val="18"/>
-                <w:szCs w:val="18"/>
-              </w:rPr>
-              <w:t xml:space="preserve"> Statistical Process Control (SPC)</w:t>
-            </w:r>
-            <w:r>
-              <w:rPr>
-                <w:rFonts w:ascii="Helvetica" w:hAnsi="Helvetica"/>
-                <w:sz w:val="18"/>
-                <w:szCs w:val="18"/>
-              </w:rPr>
-              <w:t xml:space="preserve">, </w:t>
-            </w:r>
-            <w:r>
-              <w:rPr>
-                <w:rFonts w:ascii="Helvetica" w:hAnsi="Helvetica"/>
-                <w:sz w:val="18"/>
-                <w:szCs w:val="18"/>
-              </w:rPr>
-              <w:t>Troubleshooting</w:t>
-            </w:r>
-            <w:r>
-              <w:rPr>
-                <w:rFonts w:ascii="Helvetica" w:hAnsi="Helvetica"/>
-                <w:sz w:val="18"/>
-                <w:szCs w:val="18"/>
-              </w:rPr>
-              <w:t>,</w:t>
-            </w:r>
-            <w:r>
-              <w:rPr>
-                <w:rFonts w:ascii="Helvetica" w:hAnsi="Helvetica"/>
-                <w:sz w:val="18"/>
-                <w:szCs w:val="18"/>
-              </w:rPr>
-              <w:t xml:space="preserve"> </w:t>
-            </w:r>
-            <w:r>
-              <w:rPr>
-                <w:rFonts w:ascii="Helvetica" w:hAnsi="Helvetica"/>
-                <w:sz w:val="18"/>
-                <w:szCs w:val="18"/>
-              </w:rPr>
-              <w:t>Process Monitoring</w:t>
-            </w:r>
-          </w:p>
-        </w:tc>
-      </w:tr>
-      <w:tr>
-        <w:tc>
-          <w:tcPr>
-            <w:tcW w:w="1615" w:type="dxa"/>
-          </w:tcPr>
-          <w:p>
-            <w:r>
-              <w:rPr>
-                <w:rFonts w:ascii="Helvetica" w:hAnsi="Helvetica"/>
-                <w:b/>
-                <w:bCs/>
-                <w:sz w:val="18"/>
-                <w:szCs w:val="18"/>
-              </w:rPr>
-              <w:t>Manufacturing:</w:t>
-            </w:r>
-            <w:r>
-              <w:rPr>
-                <w:rFonts w:ascii="Helvetica" w:hAnsi="Helvetica"/>
-                <w:b/>
-                <w:bCs/>
-                <w:sz w:val="18"/>
-                <w:szCs w:val="18"/>
-              </w:rPr>
-              <w:t xml:space="preserve"> </w:t>
-            </w:r>
-          </w:p>
-        </w:tc>
-        <w:tc>
-          <w:tcPr>
-            <w:tcW w:w="9175" w:type="dxa"/>
-          </w:tcPr>
-          <w:p>
-            <w:pPr>
-              <w:rPr>
-                <w:rFonts w:ascii="Helvetica" w:hAnsi="Helvetica"/>
-                <w:b/>
-                <w:bCs/>
-                <w:sz w:val="18"/>
-                <w:szCs w:val="18"/>
-              </w:rPr>
-            </w:pPr>
-            <w:r>
-              <w:rPr>
-                <w:rFonts w:ascii="Helvetica" w:hAnsi="Helvetica"/>
-                <w:sz w:val="18"/>
-                <w:szCs w:val="18"/>
-              </w:rPr>
-              <w:t>SOP Development</w:t>
-            </w:r>
-            <w:r>
-              <w:rPr>
-                <w:rFonts w:ascii="Helvetica" w:hAnsi="Helvetica"/>
-                <w:sz w:val="18"/>
-                <w:szCs w:val="18"/>
-              </w:rPr>
-              <w:t>,</w:t>
-            </w:r>
-            <w:r>
-              <w:rPr>
-                <w:rFonts w:ascii="Helvetica" w:hAnsi="Helvetica"/>
-                <w:sz w:val="18"/>
-                <w:szCs w:val="18"/>
-              </w:rPr>
-              <w:t xml:space="preserve"> Root Cause Analysis</w:t>
-            </w:r>
-            <w:r>
-              <w:rPr>
-                <w:rFonts w:ascii="Helvetica" w:hAnsi="Helvetica"/>
-                <w:sz w:val="18"/>
-                <w:szCs w:val="18"/>
-              </w:rPr>
-              <w:t xml:space="preserve">, </w:t>
-            </w:r>
-            <w:r>
-              <w:rPr>
-                <w:rFonts w:ascii="Helvetica" w:hAnsi="Helvetica"/>
-                <w:sz w:val="18"/>
-                <w:szCs w:val="18"/>
-              </w:rPr>
-              <w:t>Lean / Six Sigma</w:t>
-            </w:r>
-            <w:r>
-              <w:rPr>
-                <w:rFonts w:ascii="Helvetica" w:hAnsi="Helvetica"/>
-                <w:sz w:val="18"/>
-                <w:szCs w:val="18"/>
-              </w:rPr>
-              <w:t>,</w:t>
-            </w:r>
-            <w:r>
-              <w:rPr>
-                <w:rFonts w:ascii="Helvetica" w:hAnsi="Helvetica"/>
-                <w:sz w:val="18"/>
-                <w:szCs w:val="18"/>
-              </w:rPr>
-              <w:t xml:space="preserve"> Design of Experiments (DOE)</w:t>
-            </w:r>
-            <w:r>
-              <w:rPr>
-                <w:rFonts w:ascii="Helvetica" w:hAnsi="Helvetica"/>
-                <w:sz w:val="18"/>
-                <w:szCs w:val="18"/>
-              </w:rPr>
-              <w:t>,</w:t>
-            </w:r>
-            <w:r>
-              <w:rPr>
-                <w:rFonts w:ascii="Helvetica" w:hAnsi="Helvetica"/>
-                <w:sz w:val="18"/>
-                <w:szCs w:val="18"/>
-              </w:rPr>
-              <w:t xml:space="preserve"> Manufacturing Support</w:t>
-            </w:r>
-            <w:r>
-              <w:rPr>
-                <w:rFonts w:ascii="Helvetica" w:hAnsi="Helvetica"/>
-                <w:sz w:val="18"/>
-                <w:szCs w:val="18"/>
-              </w:rPr>
-              <w:t>,</w:t>
-            </w:r>
-            <w:r>
-              <w:rPr>
-                <w:rFonts w:ascii="Helvetica" w:hAnsi="Helvetica"/>
-                <w:sz w:val="18"/>
-                <w:szCs w:val="18"/>
-              </w:rPr>
-              <w:t xml:space="preserve"> Technology Transfer</w:t>
-            </w:r>
-            <w:r>
-              <w:rPr>
-                <w:rFonts w:ascii="Helvetica" w:hAnsi="Helvetica"/>
-                <w:sz w:val="18"/>
-                <w:szCs w:val="18"/>
-              </w:rPr>
-              <w:t xml:space="preserve">, </w:t>
-            </w:r>
-            <w:r>
-              <w:rPr>
-                <w:rFonts w:ascii="Helvetica" w:hAnsi="Helvetica"/>
-                <w:sz w:val="18"/>
-                <w:szCs w:val="18"/>
-              </w:rPr>
-              <w:t>Continuous Improvement</w:t>
-            </w:r>
-            <w:r>
-              <w:rPr>
-                <w:rFonts w:ascii="Helvetica" w:hAnsi="Helvetica"/>
-                <w:sz w:val="18"/>
-                <w:szCs w:val="18"/>
-              </w:rPr>
-              <w:t xml:space="preserve">, </w:t>
-            </w:r>
-            <w:r>
-              <w:rPr>
-                <w:rFonts w:ascii="Helvetica" w:hAnsi="Helvetica"/>
-                <w:sz w:val="18"/>
-                <w:szCs w:val="18"/>
-              </w:rPr>
-              <w:t>cGMP</w:t>
-            </w:r>
-          </w:p>
-        </w:tc>
-      </w:tr>
-      <w:tr>
-        <w:tc>
-          <w:tcPr>
-            <w:tcW w:w="1615" w:type="dxa"/>
-          </w:tcPr>
-          <w:p>
-            <w:pPr>
-              <w:rPr>
-                <w:rFonts w:ascii="Helvetica" w:hAnsi="Helvetica"/>
-                <w:b/>
-                <w:bCs/>
-                <w:sz w:val="18"/>
-                <w:szCs w:val="18"/>
-              </w:rPr>
-            </w:pPr>
-            <w:r>
-              <w:rPr>
-                <w:rFonts w:ascii="Helvetica" w:hAnsi="Helvetica"/>
-                <w:b/>
-                <w:bCs/>
-                <w:sz w:val="18"/>
-                <w:szCs w:val="18"/>
-              </w:rPr>
-              <w:t>Computational:</w:t>
-            </w:r>
-          </w:p>
-        </w:tc>
-        <w:tc>
-          <w:tcPr>
-            <w:tcW w:w="9175" w:type="dxa"/>
-          </w:tcPr>
-          <w:p>
-            <w:pPr>
-              <w:rPr>
-                <w:rFonts w:ascii="Helvetica" w:hAnsi="Helvetica"/>
-                <w:b/>
-                <w:bCs/>
-                <w:sz w:val="18"/>
-                <w:szCs w:val="18"/>
-              </w:rPr>
-            </w:pPr>
-            <w:r>
-              <w:rPr>
-                <w:rFonts w:ascii="Helvetica" w:hAnsi="Helvetica"/>
-                <w:sz w:val="18"/>
-                <w:szCs w:val="18"/>
-              </w:rPr>
-              <w:t>MATLAB</w:t>
-            </w:r>
-            <w:r>
-              <w:rPr>
-                <w:rFonts w:ascii="Helvetica" w:hAnsi="Helvetica"/>
-                <w:sz w:val="18"/>
-                <w:szCs w:val="18"/>
-              </w:rPr>
-              <w:t xml:space="preserve">, Simulink, </w:t>
-            </w:r>
-            <w:r>
-              <w:rPr>
-                <w:rFonts w:ascii="Helvetica" w:hAnsi="Helvetica"/>
-                <w:sz w:val="18"/>
-                <w:szCs w:val="18"/>
-              </w:rPr>
-              <w:t>Python</w:t>
-            </w:r>
-            <w:r>
-              <w:rPr>
-                <w:rFonts w:ascii="Helvetica" w:hAnsi="Helvetica"/>
-                <w:sz w:val="18"/>
-                <w:szCs w:val="18"/>
-              </w:rPr>
-              <w:t xml:space="preserve">, </w:t>
-            </w:r>
-            <w:r>
-              <w:rPr>
-                <w:rFonts w:ascii="Helvetica" w:hAnsi="Helvetica"/>
-                <w:sz w:val="18"/>
-                <w:szCs w:val="18"/>
-              </w:rPr>
-              <w:t>ASPEN Plus Dynamics</w:t>
-            </w:r>
-            <w:r>
-              <w:rPr>
-                <w:rFonts w:ascii="Helvetica" w:hAnsi="Helvetica"/>
-                <w:sz w:val="18"/>
-                <w:szCs w:val="18"/>
-              </w:rPr>
-              <w:t xml:space="preserve">, </w:t>
-            </w:r>
-            <w:r>
-              <w:rPr>
-                <w:rFonts w:ascii="Helvetica" w:hAnsi="Helvetica"/>
-                <w:sz w:val="18"/>
-                <w:szCs w:val="18"/>
-              </w:rPr>
-              <w:t>Linux</w:t>
-            </w:r>
-            <w:r>
-              <w:rPr>
-                <w:rFonts w:ascii="Helvetica" w:hAnsi="Helvetica"/>
-                <w:sz w:val="18"/>
-                <w:szCs w:val="18"/>
-              </w:rPr>
-              <w:t>, DFT (VASP &amp; GPAW), MD (LAMMPS)</w:t>
-            </w:r>
-          </w:p>
-        </w:tc>
-      </w:tr>
-    </w:tbl>
-    <w:p>
-      <w:pPr>
-        <w:spacing w:after="0" w:line="240" w:lineRule="auto"/>
-        <w:rPr>
-          <w:rFonts w:ascii="Helvetica" w:hAnsi="Helvetica"/>
-          <w:sz w:val="18"/>
-          <w:szCs w:val="18"/>
-        </w:rPr>
-      </w:pPr>
       <w:r>
-        <w:rPr>
-          <w:rFonts w:ascii="Helvetica" w:hAnsi="Helvetica"/>
-          <w:sz w:val="18"/>
-          <w:szCs w:val="18"/>
-        </w:rPr>
         <w:br/>
       </w:r>
     </w:p>

</xml_diff>